<commit_message>
adjusting question generator prompt
</commit_message>
<xml_diff>
--- a/design_doc/design_document.docx
+++ b/design_doc/design_document.docx
@@ -205,7 +205,7 @@
                     <pic:cNvPicPr/>
                   </pic:nvPicPr>
                   <pic:blipFill>
-                    <a:blip r:embed="rId4"/>
+                    <a:blip r:embed="rId6"/>
                     <a:stretch>
                       <a:fillRect/>
                     </a:stretch>
@@ -294,7 +294,7 @@
                     <pic:cNvPicPr/>
                   </pic:nvPicPr>
                   <pic:blipFill>
-                    <a:blip r:embed="rId5"/>
+                    <a:blip r:embed="rId7"/>
                     <a:stretch>
                       <a:fillRect/>
                     </a:stretch>
@@ -412,7 +412,7 @@
                     <pic:cNvPicPr/>
                   </pic:nvPicPr>
                   <pic:blipFill>
-                    <a:blip r:embed="rId6"/>
+                    <a:blip r:embed="rId8"/>
                     <a:stretch>
                       <a:fillRect/>
                     </a:stretch>
@@ -507,353 +507,6 @@
                 <pic:pic xmlns:pic="http://schemas.openxmlformats.org/drawingml/2006/picture">
                   <pic:nvPicPr>
                     <pic:cNvPr id="0" name="04-quiz-clarify-loop.png"/>
-                    <pic:cNvPicPr/>
-                  </pic:nvPicPr>
-                  <pic:blipFill>
-                    <a:blip r:embed="rId7"/>
-                    <a:stretch>
-                      <a:fillRect/>
-                    </a:stretch>
-                  </pic:blipFill>
-                  <pic:spPr>
-                    <a:xfrm>
-                      <a:off x="0" y="0"/>
-                      <a:ext cx="5303520" cy="1131381"/>
-                    </a:xfrm>
-                    <a:prstGeom prst="rect">
-                      <a:avLst/>
-                    </a:prstGeom>
-                  </pic:spPr>
-                </pic:pic>
-              </a:graphicData>
-            </a:graphic>
-          </wp:inline>
-        </w:drawing>
-      </w:r>
-    </w:p>
-    <w:p>
-      <w:r>
-        <w:rPr>
-          <w:rFonts w:cs="Times New Roman"/>
-        </w:rPr>
-        <w:t xml:space="preserve">When the quiz is complete, the draft and every collected answer go to </w:t>
-      </w:r>
-      <w:r>
-        <w:rPr>
-          <w:rFonts w:ascii="Courier New" w:eastAsia="Courier New" w:hAnsi="Courier New" w:cs="Courier New"/>
-          <w:sz w:val="20"/>
-        </w:rPr>
-        <w:t>src/rewriter.py</w:t>
-      </w:r>
-      <w:r>
-        <w:rPr>
-          <w:rFonts w:cs="Times New Roman"/>
-        </w:rPr>
-        <w:t xml:space="preserve">, the second AI-as-a-service call (Figure 5). Its system prompt fixes the ATS constraints directly: single-column layout, the four standard section headers, consistent date formatting, and an explicit instruction not to invent employers, titles, dates, or achievements beyond what the draft or the quiz answers actually contain. </w:t>
-      </w:r>
-      <w:r>
-        <w:rPr>
-          <w:rFonts w:ascii="Courier New" w:eastAsia="Courier New" w:hAnsi="Courier New" w:cs="Courier New"/>
-          <w:sz w:val="20"/>
-        </w:rPr>
-        <w:t>rewrite_resume_with_retry</w:t>
-      </w:r>
-      <w:r>
-        <w:rPr>
-          <w:rFonts w:cs="Times New Roman"/>
-        </w:rPr>
-        <w:t xml:space="preserve"> wraps the call with one automatic retry on failure, since the most common live-demo failure mode is a transient rate limit or network blip rather than an actual outage.</w:t>
-      </w:r>
-    </w:p>
-    <w:p>
-      <w:pPr>
-        <w:keepNext/>
-        <w:ind w:firstLine="0"/>
-      </w:pPr>
-      <w:r>
-        <w:rPr>
-          <w:rFonts w:cs="Times New Roman"/>
-          <w:b/>
-        </w:rPr>
-        <w:t>Figure 5:</w:t>
-      </w:r>
-      <w:r>
-        <w:rPr>
-          <w:rFonts w:cs="Times New Roman"/>
-          <w:i/>
-        </w:rPr>
-        <w:t xml:space="preserve"> The ATS rewrite call, with a structured prompt and one retry</w:t>
-      </w:r>
-    </w:p>
-    <w:p>
-      <w:pPr>
-        <w:keepLines/>
-        <w:spacing w:line="240" w:lineRule="auto"/>
-        <w:ind w:firstLine="0"/>
-        <w:jc w:val="center"/>
-      </w:pPr>
-      <w:r>
-        <w:rPr>
-          <w:noProof/>
-        </w:rPr>
-        <w:drawing>
-          <wp:inline distT="0" distB="0" distL="0" distR="0" wp14:anchorId="71E2D23E" wp14:editId="25A87E40">
-            <wp:extent cx="5303520" cy="1587973"/>
-            <wp:effectExtent l="0" t="0" r="0" b="0"/>
-            <wp:docPr id="5" name="Picture 5"/>
-            <wp:cNvGraphicFramePr>
-              <a:graphicFrameLocks xmlns:a="http://schemas.openxmlformats.org/drawingml/2006/main" noChangeAspect="1"/>
-            </wp:cNvGraphicFramePr>
-            <a:graphic xmlns:a="http://schemas.openxmlformats.org/drawingml/2006/main">
-              <a:graphicData uri="http://schemas.openxmlformats.org/drawingml/2006/picture">
-                <pic:pic xmlns:pic="http://schemas.openxmlformats.org/drawingml/2006/picture">
-                  <pic:nvPicPr>
-                    <pic:cNvPr id="0" name="05-ai-ats-rewrite.png"/>
-                    <pic:cNvPicPr/>
-                  </pic:nvPicPr>
-                  <pic:blipFill>
-                    <a:blip r:embed="rId8"/>
-                    <a:stretch>
-                      <a:fillRect/>
-                    </a:stretch>
-                  </pic:blipFill>
-                  <pic:spPr>
-                    <a:xfrm>
-                      <a:off x="0" y="0"/>
-                      <a:ext cx="5303520" cy="1587973"/>
-                    </a:xfrm>
-                    <a:prstGeom prst="rect">
-                      <a:avLst/>
-                    </a:prstGeom>
-                  </pic:spPr>
-                </pic:pic>
-              </a:graphicData>
-            </a:graphic>
-          </wp:inline>
-        </w:drawing>
-      </w:r>
-    </w:p>
-    <w:p>
-      <w:r>
-        <w:rPr>
-          <w:rFonts w:cs="Times New Roman"/>
-        </w:rPr>
-        <w:t>If both attempts fail, the app falls back to a cached response rather than showing a bare error, described in Section 4. The final text is rendered in a before/after view and made available for download in three formats, covered in Section 3.6.</w:t>
-      </w:r>
-    </w:p>
-    <w:p>
-      <w:pPr>
-        <w:pStyle w:val="Heading1"/>
-      </w:pPr>
-      <w:r>
-        <w:rPr>
-          <w:rFonts w:ascii="Times New Roman" w:eastAsia="Times New Roman" w:hAnsi="Times New Roman" w:cs="Times New Roman"/>
-          <w:b/>
-          <w:color w:val="000000"/>
-          <w:sz w:val="24"/>
-        </w:rPr>
-        <w:lastRenderedPageBreak/>
-        <w:t>3. Component Design and Rationale</w:t>
-      </w:r>
-    </w:p>
-    <w:p>
-      <w:pPr>
-        <w:pStyle w:val="Heading2"/>
-      </w:pPr>
-      <w:r>
-        <w:rPr>
-          <w:rFonts w:ascii="Times New Roman" w:eastAsia="Times New Roman" w:hAnsi="Times New Roman" w:cs="Times New Roman"/>
-          <w:b/>
-          <w:color w:val="000000"/>
-          <w:sz w:val="24"/>
-        </w:rPr>
-        <w:t>3.1 Why two rounds of AI-as-a-service, not one</w:t>
-      </w:r>
-    </w:p>
-    <w:p>
-      <w:r>
-        <w:rPr>
-          <w:rFonts w:cs="Times New Roman"/>
-        </w:rPr>
-        <w:t>The architecture calls the OpenAI API twice: once to help generate questions, once to rewrite. An earlier version of the design called it only once, for the rewrite. That version worked, but it made the “traditional chatbot” half of the project do all the interesting work and left the AI-as-a-service half doing something a single well-crafted static prompt could have done just as well. Splitting question generation into its own API call gives the AI layer a job the rule-based layer structurally cannot do: reading the actual content of a specific resume and asking about what's ambiguous in it, as opposed to matching fixed patterns like missing dates or vague titles. The two calls also demonstrate two different prompting problems: one that must produce a short, bounded list of novel questions without repeating a supplied list, and one that must produce a long, structurally constrained document while inventing nothing. That contrast is part of the intended prompt-engineering material for the course discussion.</w:t>
-      </w:r>
-    </w:p>
-    <w:p>
-      <w:pPr>
-        <w:pStyle w:val="Heading2"/>
-      </w:pPr>
-      <w:r>
-        <w:rPr>
-          <w:rFonts w:ascii="Times New Roman" w:eastAsia="Times New Roman" w:hAnsi="Times New Roman" w:cs="Times New Roman"/>
-          <w:b/>
-          <w:color w:val="000000"/>
-          <w:sz w:val="24"/>
-        </w:rPr>
-        <w:t>3.2 Gap detection thresholds and the round-robin cap</w:t>
-      </w:r>
-    </w:p>
-    <w:p>
-      <w:r>
-        <w:rPr>
-          <w:rFonts w:cs="Times New Roman"/>
-        </w:rPr>
-        <w:t>Capping the question queue at five and flooring it at two were both judgment calls, not derived from user testing. Five was chosen as an upper bound on how many questions a user would tolerate answering before the “let a chatbot fix my resume” pitch starts to feel like homework. Two was chosen as the minimum needed for the quiz to feel like it did something, rather than a single throwaway question. The round-robin interleaving across the three rule-based categories exists because an early version of the detector, tested against a resume with several missing dates and only one vague title, produced a queue of four consecutive date questions and cut off before reaching the vague-title or unquantified-bullet checks at all. Interleaving before capping fixed that without changing any individual detector's logic.</w:t>
-      </w:r>
-    </w:p>
-    <w:p>
-      <w:pPr>
-        <w:pStyle w:val="Heading2"/>
-      </w:pPr>
-      <w:r>
-        <w:rPr>
-          <w:rFonts w:ascii="Times New Roman" w:eastAsia="Times New Roman" w:hAnsi="Times New Roman" w:cs="Times New Roman"/>
-          <w:b/>
-          <w:color w:val="000000"/>
-          <w:sz w:val="24"/>
-        </w:rPr>
-        <w:lastRenderedPageBreak/>
-        <w:t>3.3 The Markdown-stripping fix</w:t>
-      </w:r>
-    </w:p>
-    <w:p>
-      <w:r>
-        <w:rPr>
-          <w:rFonts w:cs="Times New Roman"/>
-        </w:rPr>
-        <w:t xml:space="preserve">During testing, the rewrite output started showing up with literal </w:t>
-      </w:r>
-      <w:r>
-        <w:rPr>
-          <w:rFonts w:ascii="Courier New" w:eastAsia="Courier New" w:hAnsi="Courier New" w:cs="Courier New"/>
-          <w:sz w:val="20"/>
-        </w:rPr>
-        <w:t>**</w:t>
-      </w:r>
-      <w:r>
-        <w:rPr>
-          <w:rFonts w:cs="Times New Roman"/>
-        </w:rPr>
-        <w:t xml:space="preserve"> characters around job titles and company names in every export format: TXT, DOCX, and PDF. The cause was the model defaulting to Markdown bold syntax in its response, a habit picked up from chat-formatted training data, despite the system prompt never asking for it. None of the three export paths interpret Markdown, so the asterisks passed through as literal text, exactly the kind of artifact a real ATS parser would also choke on. The fix has two parts. The system prompt in </w:t>
-      </w:r>
-      <w:r>
-        <w:rPr>
-          <w:rFonts w:ascii="Courier New" w:eastAsia="Courier New" w:hAnsi="Courier New" w:cs="Courier New"/>
-          <w:sz w:val="20"/>
-        </w:rPr>
-        <w:t>rewriter.py</w:t>
-      </w:r>
-      <w:r>
-        <w:rPr>
-          <w:rFonts w:cs="Times New Roman"/>
-        </w:rPr>
-        <w:t xml:space="preserve"> now explicitly forbids Markdown formatting and states why: the output is exported as-is and literal formatting characters will appear in the final resume. A regex-based </w:t>
-      </w:r>
-      <w:r>
-        <w:rPr>
-          <w:rFonts w:ascii="Courier New" w:eastAsia="Courier New" w:hAnsi="Courier New" w:cs="Courier New"/>
-          <w:sz w:val="20"/>
-        </w:rPr>
-        <w:t>strip_markdown_emphasis</w:t>
-      </w:r>
-      <w:r>
-        <w:rPr>
-          <w:rFonts w:cs="Times New Roman"/>
-        </w:rPr>
-        <w:t xml:space="preserve"> function also runs on every API response before it reaches session state, removing any </w:t>
-      </w:r>
-      <w:r>
-        <w:rPr>
-          <w:rFonts w:ascii="Courier New" w:eastAsia="Courier New" w:hAnsi="Courier New" w:cs="Courier New"/>
-          <w:sz w:val="20"/>
-        </w:rPr>
-        <w:t>**bold**</w:t>
-      </w:r>
-      <w:r>
-        <w:rPr>
-          <w:rFonts w:cs="Times New Roman"/>
-        </w:rPr>
-        <w:t xml:space="preserve"> or </w:t>
-      </w:r>
-      <w:r>
-        <w:rPr>
-          <w:rFonts w:ascii="Courier New" w:eastAsia="Courier New" w:hAnsi="Courier New" w:cs="Courier New"/>
-          <w:sz w:val="20"/>
-        </w:rPr>
-        <w:t>__bold__</w:t>
-      </w:r>
-      <w:r>
-        <w:rPr>
-          <w:rFonts w:cs="Times New Roman"/>
-        </w:rPr>
-        <w:t xml:space="preserve"> markers that get through anyway. Prompt instructions alone were not treated as sufficient, since instruction-following on a single stylistic constraint is not guaranteed on every call, and the cost of a defensive regex pass is small next to the cost of a visibly broken resume during a live demo.</w:t>
-      </w:r>
-    </w:p>
-    <w:p>
-      <w:pPr>
-        <w:pStyle w:val="Heading2"/>
-      </w:pPr>
-      <w:r>
-        <w:rPr>
-          <w:rFonts w:ascii="Times New Roman" w:eastAsia="Times New Roman" w:hAnsi="Times New Roman" w:cs="Times New Roman"/>
-          <w:b/>
-          <w:color w:val="000000"/>
-          <w:sz w:val="24"/>
-        </w:rPr>
-        <w:t>3.4 Output formats: TXT, DOCX, and a LaTeX-rendered PDF</w:t>
-      </w:r>
-    </w:p>
-    <w:p>
-      <w:r>
-        <w:rPr>
-          <w:rFonts w:cs="Times New Roman"/>
-        </w:rPr>
-        <w:t>The output layer (Figure 6) originally supported plain text and DOCX. A third format, PDF, was added afterward, and it required resolving a real tension in the requirement itself.</w:t>
-      </w:r>
-    </w:p>
-    <w:p>
-      <w:pPr>
-        <w:keepNext/>
-        <w:ind w:firstLine="0"/>
-      </w:pPr>
-      <w:r>
-        <w:rPr>
-          <w:rFonts w:cs="Times New Roman"/>
-          <w:b/>
-        </w:rPr>
-        <w:t>Figure 6:</w:t>
-      </w:r>
-      <w:r>
-        <w:rPr>
-          <w:rFonts w:cs="Times New Roman"/>
-          <w:i/>
-        </w:rPr>
-        <w:t xml:space="preserve"> Output layer, including the LaTeX-rendered PDF export added after the initial build</w:t>
-      </w:r>
-    </w:p>
-    <w:p>
-      <w:pPr>
-        <w:keepLines/>
-        <w:spacing w:line="240" w:lineRule="auto"/>
-        <w:ind w:firstLine="0"/>
-        <w:jc w:val="center"/>
-      </w:pPr>
-      <w:r>
-        <w:rPr>
-          <w:noProof/>
-        </w:rPr>
-        <w:drawing>
-          <wp:inline distT="0" distB="0" distL="0" distR="0" wp14:anchorId="4C001C1D" wp14:editId="3B436D96">
-            <wp:extent cx="5303520" cy="1131381"/>
-            <wp:effectExtent l="0" t="0" r="0" b="0"/>
-            <wp:docPr id="6" name="Picture 6"/>
-            <wp:cNvGraphicFramePr>
-              <a:graphicFrameLocks xmlns:a="http://schemas.openxmlformats.org/drawingml/2006/main" noChangeAspect="1"/>
-            </wp:cNvGraphicFramePr>
-            <a:graphic xmlns:a="http://schemas.openxmlformats.org/drawingml/2006/main">
-              <a:graphicData uri="http://schemas.openxmlformats.org/drawingml/2006/picture">
-                <pic:pic xmlns:pic="http://schemas.openxmlformats.org/drawingml/2006/picture">
-                  <pic:nvPicPr>
-                    <pic:cNvPr id="0" name="07-output-layer.png"/>
                     <pic:cNvPicPr/>
                   </pic:nvPicPr>
                   <pic:blipFill>
@@ -883,211 +536,114 @@
         <w:rPr>
           <w:rFonts w:cs="Times New Roman"/>
         </w:rPr>
-        <w:t xml:space="preserve">“Clean, professional PDF” and “ATS-safe” pull in different directions. Most polished-looking LaTeX resume templates use multi-column layouts, custom fonts, or graphical elements, </w:t>
-      </w:r>
-      <w:r>
-        <w:rPr>
-          <w:rFonts w:cs="Times New Roman"/>
-        </w:rPr>
-        <w:lastRenderedPageBreak/>
-        <w:t xml:space="preserve">exactly the formatting choices that break automated resume parsers. Rather than pick a visually rich template and lose ATS safety, </w:t>
-      </w:r>
-      <w:r>
-        <w:rPr>
-          <w:rFonts w:ascii="Courier New" w:eastAsia="Courier New" w:hAnsi="Courier New" w:cs="Courier New"/>
-          <w:sz w:val="20"/>
-        </w:rPr>
-        <w:t>src/latex_export.py</w:t>
-      </w:r>
-      <w:r>
-        <w:rPr>
-          <w:rFonts w:cs="Times New Roman"/>
-        </w:rPr>
-        <w:t xml:space="preserve"> generates a deliberately minimal, single-column LaTeX </w:t>
-      </w:r>
-      <w:r>
-        <w:rPr>
-          <w:rFonts w:ascii="Courier New" w:eastAsia="Courier New" w:hAnsi="Courier New" w:cs="Courier New"/>
-          <w:sz w:val="20"/>
-        </w:rPr>
-        <w:t>article</w:t>
-      </w:r>
-      <w:r>
-        <w:rPr>
-          <w:rFonts w:cs="Times New Roman"/>
-        </w:rPr>
-        <w:t xml:space="preserve"> document: bold section headers, plain </w:t>
-      </w:r>
-      <w:r>
-        <w:rPr>
-          <w:rFonts w:ascii="Courier New" w:eastAsia="Courier New" w:hAnsi="Courier New" w:cs="Courier New"/>
-          <w:sz w:val="20"/>
-        </w:rPr>
-        <w:t>itemize</w:t>
-      </w:r>
-      <w:r>
-        <w:rPr>
-          <w:rFonts w:cs="Times New Roman"/>
-        </w:rPr>
-        <w:t xml:space="preserve"> bullets, no packages beyond basic margins and font substitution. The same plain-text structure that </w:t>
-      </w:r>
-      <w:r>
-        <w:rPr>
-          <w:rFonts w:ascii="Courier New" w:eastAsia="Courier New" w:hAnsi="Courier New" w:cs="Courier New"/>
-          <w:sz w:val="20"/>
-        </w:rPr>
-        <w:t>resume_export.py</w:t>
-      </w:r>
-      <w:r>
-        <w:rPr>
-          <w:rFonts w:cs="Times New Roman"/>
-        </w:rPr>
-        <w:t xml:space="preserve"> already parses for DOCX (section headers, </w:t>
-      </w:r>
-      <w:r>
-        <w:rPr>
-          <w:rFonts w:ascii="Courier New" w:eastAsia="Courier New" w:hAnsi="Courier New" w:cs="Courier New"/>
-          <w:sz w:val="20"/>
-        </w:rPr>
-        <w:t xml:space="preserve">- </w:t>
-      </w:r>
-      <w:r>
-        <w:rPr>
-          <w:rFonts w:cs="Times New Roman"/>
-        </w:rPr>
-        <w:t xml:space="preserve"> bullets, plain paragraph lines) feeds both exporters, so all three download formats stay in sync without duplicating the parsing logic three times.</w:t>
-      </w:r>
-    </w:p>
-    <w:p>
-      <w:r>
-        <w:rPr>
-          <w:rFonts w:cs="Times New Roman"/>
-        </w:rPr>
-        <w:t xml:space="preserve">Compilation happens by shelling out to a local </w:t>
-      </w:r>
-      <w:r>
-        <w:rPr>
-          <w:rFonts w:ascii="Courier New" w:eastAsia="Courier New" w:hAnsi="Courier New" w:cs="Courier New"/>
-          <w:sz w:val="20"/>
-        </w:rPr>
-        <w:t>pdflatex</w:t>
-      </w:r>
-      <w:r>
-        <w:rPr>
-          <w:rFonts w:cs="Times New Roman"/>
-        </w:rPr>
-        <w:t xml:space="preserve">, run with </w:t>
-      </w:r>
-      <w:r>
-        <w:rPr>
-          <w:rFonts w:ascii="Courier New" w:eastAsia="Courier New" w:hAnsi="Courier New" w:cs="Courier New"/>
-          <w:sz w:val="20"/>
-        </w:rPr>
-        <w:t>-no-shell-escape</w:t>
-      </w:r>
-      <w:r>
-        <w:rPr>
-          <w:rFonts w:cs="Times New Roman"/>
-        </w:rPr>
-        <w:t xml:space="preserve"> to keep the compiled input from being able to execute arbitrary commands, since the LaTeX source is built from model output that the team does not fully control. This was a deliberate choice among three options considered: a local LaTeX engine (chosen), Tectonic (a self-contained LaTeX binary that still requires an external dependency and a first-run network fetch), and a pure-Python PDF library with no system dependency at all. The team picked the local-engine approach because MiKTeX was already installed on the development machine and produced real LaTeX-typeset output (not an approximation), at the cost of adding a system dependency the demo environment must have. That cost is mitigated two ways: the PDF button is wrapped in a try/except in </w:t>
-      </w:r>
-      <w:r>
-        <w:rPr>
-          <w:rFonts w:ascii="Courier New" w:eastAsia="Courier New" w:hAnsi="Courier New" w:cs="Courier New"/>
-          <w:sz w:val="20"/>
-        </w:rPr>
-        <w:t>app.py</w:t>
-      </w:r>
-      <w:r>
-        <w:rPr>
-          <w:rFonts w:cs="Times New Roman"/>
-        </w:rPr>
-        <w:t xml:space="preserve">, so a missing </w:t>
-      </w:r>
-      <w:r>
-        <w:rPr>
-          <w:rFonts w:ascii="Courier New" w:eastAsia="Courier New" w:hAnsi="Courier New" w:cs="Courier New"/>
-          <w:sz w:val="20"/>
-        </w:rPr>
-        <w:t>pdflatex</w:t>
-      </w:r>
-      <w:r>
-        <w:rPr>
-          <w:rFonts w:cs="Times New Roman"/>
-        </w:rPr>
-        <w:t xml:space="preserve"> degrades to a caption explaining the PDF is unavailable rather than crashing the page, and </w:t>
-      </w:r>
-      <w:r>
-        <w:rPr>
-          <w:rFonts w:ascii="Courier New" w:eastAsia="Courier New" w:hAnsi="Courier New" w:cs="Courier New"/>
-          <w:sz w:val="20"/>
-        </w:rPr>
-        <w:t>README.md</w:t>
-      </w:r>
-      <w:r>
-        <w:rPr>
-          <w:rFonts w:cs="Times New Roman"/>
-        </w:rPr>
-        <w:t xml:space="preserve"> documents per-OS installation steps (MiKTeX, MacTeX/BasicTeX, or the </w:t>
-      </w:r>
-      <w:r>
-        <w:rPr>
-          <w:rFonts w:ascii="Courier New" w:eastAsia="Courier New" w:hAnsi="Courier New" w:cs="Courier New"/>
-          <w:sz w:val="20"/>
-        </w:rPr>
-        <w:t>texlive</w:t>
-      </w:r>
-      <w:r>
-        <w:rPr>
-          <w:rFonts w:cs="Times New Roman"/>
-        </w:rPr>
-        <w:t xml:space="preserve"> packages on Linux) for anyone setting up the project fresh.</w:t>
-      </w:r>
-    </w:p>
-    <w:p>
-      <w:r>
-        <w:rPr>
-          <w:rFonts w:cs="Times New Roman"/>
-        </w:rPr>
-        <w:t xml:space="preserve">One design decision was made deliberately conservative: LaTeX generation stays entirely in application code, not in the model. The rewriter's output is still plain text; </w:t>
-      </w:r>
-      <w:r>
-        <w:rPr>
-          <w:rFonts w:ascii="Courier New" w:eastAsia="Courier New" w:hAnsi="Courier New" w:cs="Courier New"/>
-          <w:sz w:val="20"/>
-        </w:rPr>
-        <w:t>build_latex</w:t>
-      </w:r>
-      <w:r>
-        <w:rPr>
-          <w:rFonts w:cs="Times New Roman"/>
-        </w:rPr>
-        <w:t xml:space="preserve"> is the only thing that ever produces </w:t>
-      </w:r>
-      <w:r>
-        <w:rPr>
-          <w:rFonts w:ascii="Courier New" w:eastAsia="Courier New" w:hAnsi="Courier New" w:cs="Courier New"/>
-          <w:sz w:val="20"/>
-        </w:rPr>
-        <w:t>.tex</w:t>
-      </w:r>
-      <w:r>
-        <w:rPr>
-          <w:rFonts w:cs="Times New Roman"/>
-        </w:rPr>
-        <w:t xml:space="preserve"> source. Letting the LLM emit raw LaTeX directly would risk </w:t>
-      </w:r>
-      <w:r>
-        <w:rPr>
-          <w:rFonts w:cs="Times New Roman"/>
-        </w:rPr>
-        <w:lastRenderedPageBreak/>
-        <w:t>malformed commands breaking compilation and would turn the PDF export into a code-injection surface, since compiling LLM-authored LaTeX means compiling unvalidated input.</w:t>
-      </w:r>
-    </w:p>
-    <w:p>
-      <w:pPr>
-        <w:pStyle w:val="Heading2"/>
+        <w:t xml:space="preserve">When the quiz is complete, the draft and every collected answer go to </w:t>
+      </w:r>
+      <w:r>
+        <w:rPr>
+          <w:rFonts w:ascii="Courier New" w:eastAsia="Courier New" w:hAnsi="Courier New" w:cs="Courier New"/>
+          <w:sz w:val="20"/>
+        </w:rPr>
+        <w:t>src/rewriter.py</w:t>
+      </w:r>
+      <w:r>
+        <w:rPr>
+          <w:rFonts w:cs="Times New Roman"/>
+        </w:rPr>
+        <w:t xml:space="preserve">, the second AI-as-a-service call (Figure 5). Its system prompt fixes the ATS constraints directly: single-column layout, the four standard section headers, consistent date formatting, and an explicit instruction not to invent employers, titles, dates, or achievements beyond what the draft or the quiz answers actually contain. </w:t>
+      </w:r>
+      <w:r>
+        <w:rPr>
+          <w:rFonts w:ascii="Courier New" w:eastAsia="Courier New" w:hAnsi="Courier New" w:cs="Courier New"/>
+          <w:sz w:val="20"/>
+        </w:rPr>
+        <w:t>rewrite_resume_with_retry</w:t>
+      </w:r>
+      <w:r>
+        <w:rPr>
+          <w:rFonts w:cs="Times New Roman"/>
+        </w:rPr>
+        <w:t xml:space="preserve"> wraps the call with one automatic retry on failure, since the most common live-demo failure mode is a transient rate limit or network blip rather than an actual outage.</w:t>
+      </w:r>
+    </w:p>
+    <w:p>
+      <w:pPr>
+        <w:keepNext/>
+        <w:ind w:firstLine="0"/>
+      </w:pPr>
+      <w:r>
+        <w:rPr>
+          <w:rFonts w:cs="Times New Roman"/>
+          <w:b/>
+        </w:rPr>
+        <w:t>Figure 5:</w:t>
+      </w:r>
+      <w:r>
+        <w:rPr>
+          <w:rFonts w:cs="Times New Roman"/>
+          <w:i/>
+        </w:rPr>
+        <w:t xml:space="preserve"> The ATS rewrite call, with a structured prompt and one retry</w:t>
+      </w:r>
+    </w:p>
+    <w:p>
+      <w:pPr>
+        <w:keepLines/>
+        <w:spacing w:line="240" w:lineRule="auto"/>
+        <w:ind w:firstLine="0"/>
+        <w:jc w:val="center"/>
+      </w:pPr>
+      <w:r>
+        <w:rPr>
+          <w:noProof/>
+        </w:rPr>
+        <w:drawing>
+          <wp:inline distT="0" distB="0" distL="0" distR="0" wp14:anchorId="71E2D23E" wp14:editId="25A87E40">
+            <wp:extent cx="5303520" cy="1587973"/>
+            <wp:effectExtent l="0" t="0" r="0" b="0"/>
+            <wp:docPr id="5" name="Picture 5"/>
+            <wp:cNvGraphicFramePr>
+              <a:graphicFrameLocks xmlns:a="http://schemas.openxmlformats.org/drawingml/2006/main" noChangeAspect="1"/>
+            </wp:cNvGraphicFramePr>
+            <a:graphic xmlns:a="http://schemas.openxmlformats.org/drawingml/2006/main">
+              <a:graphicData uri="http://schemas.openxmlformats.org/drawingml/2006/picture">
+                <pic:pic xmlns:pic="http://schemas.openxmlformats.org/drawingml/2006/picture">
+                  <pic:nvPicPr>
+                    <pic:cNvPr id="0" name="05-ai-ats-rewrite.png"/>
+                    <pic:cNvPicPr/>
+                  </pic:nvPicPr>
+                  <pic:blipFill>
+                    <a:blip r:embed="rId10"/>
+                    <a:stretch>
+                      <a:fillRect/>
+                    </a:stretch>
+                  </pic:blipFill>
+                  <pic:spPr>
+                    <a:xfrm>
+                      <a:off x="0" y="0"/>
+                      <a:ext cx="5303520" cy="1587973"/>
+                    </a:xfrm>
+                    <a:prstGeom prst="rect">
+                      <a:avLst/>
+                    </a:prstGeom>
+                  </pic:spPr>
+                </pic:pic>
+              </a:graphicData>
+            </a:graphic>
+          </wp:inline>
+        </w:drawing>
+      </w:r>
+    </w:p>
+    <w:p>
+      <w:r>
+        <w:rPr>
+          <w:rFonts w:cs="Times New Roman"/>
+        </w:rPr>
+        <w:t>If both attempts fail, the app falls back to a cached response rather than showing a bare error, described in Section 4. The final text is rendered in a before/after view and made available for download in three formats, covered in Section 3.6.</w:t>
+      </w:r>
+    </w:p>
+    <w:p>
+      <w:pPr>
+        <w:pStyle w:val="Heading1"/>
       </w:pPr>
       <w:r>
         <w:rPr>
@@ -1096,90 +652,8 @@
           <w:color w:val="000000"/>
           <w:sz w:val="24"/>
         </w:rPr>
-        <w:t>3.5 Quiz navigation: back, skip, and inline editing</w:t>
-      </w:r>
-    </w:p>
-    <w:p>
-      <w:r>
-        <w:rPr>
-          <w:rFonts w:cs="Times New Roman"/>
-        </w:rPr>
-        <w:t>The quiz originally moved in one direction only. Skipping a question meant typing the literal word “skip” into the chat input, and there was no way to revisit or correct an earlier answer short of restarting the whole flow. Both limits got fixed together, since they turned out to share the same underlying problem.</w:t>
-      </w:r>
-    </w:p>
-    <w:p>
-      <w:r>
-        <w:rPr>
-          <w:rFonts w:cs="Times New Roman"/>
-        </w:rPr>
-        <w:t xml:space="preserve">Two explicit buttons, Back and Skip, replaced the typed convention. Back steps </w:t>
-      </w:r>
-      <w:r>
-        <w:rPr>
-          <w:rFonts w:ascii="Courier New" w:eastAsia="Courier New" w:hAnsi="Courier New" w:cs="Courier New"/>
-          <w:sz w:val="20"/>
-        </w:rPr>
-        <w:t>current_gap_index</w:t>
-      </w:r>
-      <w:r>
-        <w:rPr>
-          <w:rFonts w:cs="Times New Roman"/>
-        </w:rPr>
-        <w:t xml:space="preserve"> down by one and re-presents the previous question; whatever answer was already recorded for it stays in place until the user types a new one or hits Skip. Skip clears any existing answer for the current question and advances, marking it explicitly unresolved rather than silently keeping a stale value. A third control, a small edit button next to each answered question in the transcript, jumps the index directly to that question instead of requiring one Back click per step, useful once the quiz runs several questions deep and the mistake was near the start.</w:t>
-      </w:r>
-    </w:p>
-    <w:p>
-      <w:r>
-        <w:rPr>
-          <w:rFonts w:cs="Times New Roman"/>
-        </w:rPr>
-        <w:t xml:space="preserve">Adding real backward navigation exposed a bug in how the transcript was built. The original code displayed every entry in </w:t>
-      </w:r>
-      <w:r>
-        <w:rPr>
-          <w:rFonts w:ascii="Courier New" w:eastAsia="Courier New" w:hAnsi="Courier New" w:cs="Courier New"/>
-          <w:sz w:val="20"/>
-        </w:rPr>
-        <w:t>st.session_state.answers</w:t>
-      </w:r>
-      <w:r>
-        <w:rPr>
-          <w:rFonts w:cs="Times New Roman"/>
-        </w:rPr>
-        <w:t xml:space="preserve"> in dict insertion order, which works fine as long as answering only ever moves forward. Once a user could jump backward and re-answer a question, that same dict could hold an answer for a question the user had not reached again yet on this pass, and the transcript would show it anyway, or show a stale answer twice next to the question being re-asked. The fix was to stop trusting the dict's own order and derive the transcript from </w:t>
-      </w:r>
-      <w:r>
-        <w:rPr>
-          <w:rFonts w:ascii="Courier New" w:eastAsia="Courier New" w:hAnsi="Courier New" w:cs="Courier New"/>
-          <w:sz w:val="20"/>
-        </w:rPr>
-        <w:t>gaps[:idx]</w:t>
-      </w:r>
-      <w:r>
-        <w:rPr>
-          <w:rFonts w:cs="Times New Roman"/>
-        </w:rPr>
-        <w:t xml:space="preserve"> instead, looking up each gap's answer with </w:t>
-      </w:r>
-      <w:r>
-        <w:rPr>
-          <w:rFonts w:ascii="Courier New" w:eastAsia="Courier New" w:hAnsi="Courier New" w:cs="Courier New"/>
-          <w:sz w:val="20"/>
-        </w:rPr>
-        <w:t>.get(...)</w:t>
-      </w:r>
-      <w:r>
-        <w:rPr>
-          <w:rFonts w:cs="Times New Roman"/>
-        </w:rPr>
-        <w:t xml:space="preserve"> as it goes. What renders is always exactly the questions already passed on the current </w:t>
-      </w:r>
-      <w:r>
-        <w:rPr>
-          <w:rFonts w:cs="Times New Roman"/>
-        </w:rPr>
         <w:lastRenderedPageBreak/>
-        <w:t>pass through the quiz, independent of whatever else is sitting in the answers dict. The full answer, skip, back, and re-answer sequence was checked in a standalone script before it went into the UI, confirming the transcript and the stored answers stayed in sync across a back-then-reanswer round trip.</w:t>
+        <w:t>3. Component Design and Rationale</w:t>
       </w:r>
     </w:p>
     <w:p>
@@ -1193,83 +667,15 @@
           <w:color w:val="000000"/>
           <w:sz w:val="24"/>
         </w:rPr>
-        <w:t>3.6 Diff highlighting between draft and rewrite</w:t>
-      </w:r>
-    </w:p>
-    <w:p>
-      <w:r>
-        <w:rPr>
-          <w:rFonts w:cs="Times New Roman"/>
-        </w:rPr>
-        <w:t xml:space="preserve">The before/after view originally showed the draft and the rewrite as two blocks of plain text side by side, with nothing marking what had actually changed beyond what the reader could spot by eye. </w:t>
-      </w:r>
-      <w:r>
-        <w:rPr>
-          <w:rFonts w:ascii="Courier New" w:eastAsia="Courier New" w:hAnsi="Courier New" w:cs="Courier New"/>
-          <w:sz w:val="20"/>
-        </w:rPr>
-        <w:t>src/diff_view.py</w:t>
-      </w:r>
-      <w:r>
-        <w:rPr>
-          <w:rFonts w:cs="Times New Roman"/>
-        </w:rPr>
-        <w:t xml:space="preserve"> adds a word-level diff, computed with Python's own </w:t>
-      </w:r>
-      <w:r>
-        <w:rPr>
-          <w:rFonts w:ascii="Courier New" w:eastAsia="Courier New" w:hAnsi="Courier New" w:cs="Courier New"/>
-          <w:sz w:val="20"/>
-        </w:rPr>
-        <w:t>difflib.SequenceMatcher</w:t>
-      </w:r>
-      <w:r>
-        <w:rPr>
-          <w:rFonts w:cs="Times New Roman"/>
-        </w:rPr>
-        <w:t xml:space="preserve"> rather than a new dependency, comparing the two texts token by token. Tokens are split on </w:t>
-      </w:r>
-      <w:r>
-        <w:rPr>
-          <w:rFonts w:ascii="Courier New" w:eastAsia="Courier New" w:hAnsi="Courier New" w:cs="Courier New"/>
-          <w:sz w:val="20"/>
-        </w:rPr>
-        <w:t>\S+|\s+</w:t>
-      </w:r>
-      <w:r>
-        <w:rPr>
-          <w:rFonts w:cs="Times New Roman"/>
-        </w:rPr>
-        <w:t xml:space="preserve"> rather than on whitespace alone, so line breaks survive as their own tokens and the reconstructed text keeps its original layout.</w:t>
-      </w:r>
-    </w:p>
-    <w:p>
-      <w:r>
-        <w:rPr>
-          <w:rFonts w:cs="Times New Roman"/>
-        </w:rPr>
-        <w:t xml:space="preserve">Words the matcher marks as removed get a struck-through red span in the original-draft panel; words marked as added get a highlighted green span in the rewrite panel. Both panels are HTML-escaped before the highlight spans go in, since the diff output is rendered through </w:t>
-      </w:r>
-      <w:r>
-        <w:rPr>
-          <w:rFonts w:ascii="Courier New" w:eastAsia="Courier New" w:hAnsi="Courier New" w:cs="Courier New"/>
-          <w:sz w:val="20"/>
-        </w:rPr>
-        <w:t>unsafe_allow_html</w:t>
-      </w:r>
-      <w:r>
-        <w:rPr>
-          <w:rFonts w:cs="Times New Roman"/>
-        </w:rPr>
-        <w:t xml:space="preserve"> and the underlying resume text is user-supplied. A small legend sits above both panels using the same two span classes, so the color key is never separate from what it explains. Colors are drawn from the same light/dark palette selection as the rest of the app's custom styling, described in Section 3.7.</w:t>
-      </w:r>
-    </w:p>
-    <w:p>
-      <w:r>
-        <w:rPr>
-          <w:rFonts w:cs="Times New Roman"/>
-        </w:rPr>
-        <w:t>Because the rewrite is a full regeneration rather than a light edit, new section headers appear, content gets reordered, and bullets get rewritten rather than lightly touched. A word-level diff against that much structural change will show large stretches as removed-and-added rather than small in-place edits. That reflects what actually happened to the resume; it is not a sign the diff logic needs sentence- or paragraph-level alignment instead.</w:t>
+        <w:t>3.1 Why two rounds of AI-as-a-service, not one</w:t>
+      </w:r>
+    </w:p>
+    <w:p>
+      <w:r>
+        <w:rPr>
+          <w:rFonts w:cs="Times New Roman"/>
+        </w:rPr>
+        <w:t>The architecture calls the OpenAI API twice: once to help generate questions, once to rewrite. An earlier version of the design called it only once, for the rewrite. That version worked, but it made the “traditional chatbot” half of the project do all the interesting work and left the AI-as-a-service half doing something a single well-crafted static prompt could have done just as well. Splitting question generation into its own API call gives the AI layer a job the rule-based layer structurally cannot do: reading the actual content of a specific resume and asking about what's ambiguous in it, as opposed to matching fixed patterns like missing dates or vague titles. The two calls also demonstrate two different prompting problems: one that must produce a short, bounded list of novel questions without repeating a supplied list, and one that must produce a long, structurally constrained document while inventing nothing. That contrast is part of the intended prompt-engineering material for the course discussion.</w:t>
       </w:r>
     </w:p>
     <w:p>
@@ -1283,6 +689,600 @@
           <w:color w:val="000000"/>
           <w:sz w:val="24"/>
         </w:rPr>
+        <w:t>3.2 Gap detection thresholds and the round-robin cap</w:t>
+      </w:r>
+    </w:p>
+    <w:p>
+      <w:r>
+        <w:rPr>
+          <w:rFonts w:cs="Times New Roman"/>
+        </w:rPr>
+        <w:t>Capping the question queue at five and flooring it at two were both judgment calls, not derived from user testing. Five was chosen as an upper bound on how many questions a user would tolerate answering before the “let a chatbot fix my resume” pitch starts to feel like homework. Two was chosen as the minimum needed for the quiz to feel like it did something, rather than a single throwaway question. The round-robin interleaving across the three rule-based categories exists because an early version of the detector, tested against a resume with several missing dates and only one vague title, produced a queue of four consecutive date questions and cut off before reaching the vague-title or unquantified-bullet checks at all. Interleaving before capping fixed that without changing any individual detector's logic.</w:t>
+      </w:r>
+    </w:p>
+    <w:p>
+      <w:pPr>
+        <w:pStyle w:val="Heading2"/>
+      </w:pPr>
+      <w:r>
+        <w:rPr>
+          <w:rFonts w:ascii="Times New Roman" w:eastAsia="Times New Roman" w:hAnsi="Times New Roman" w:cs="Times New Roman"/>
+          <w:b/>
+          <w:color w:val="000000"/>
+          <w:sz w:val="24"/>
+        </w:rPr>
+        <w:lastRenderedPageBreak/>
+        <w:t>3.3 The Markdown-stripping fix</w:t>
+      </w:r>
+    </w:p>
+    <w:p>
+      <w:r>
+        <w:rPr>
+          <w:rFonts w:cs="Times New Roman"/>
+        </w:rPr>
+        <w:t xml:space="preserve">During testing, the rewrite output started showing up with literal </w:t>
+      </w:r>
+      <w:r>
+        <w:rPr>
+          <w:rFonts w:ascii="Courier New" w:eastAsia="Courier New" w:hAnsi="Courier New" w:cs="Courier New"/>
+          <w:sz w:val="20"/>
+        </w:rPr>
+        <w:t>**</w:t>
+      </w:r>
+      <w:r>
+        <w:rPr>
+          <w:rFonts w:cs="Times New Roman"/>
+        </w:rPr>
+        <w:t xml:space="preserve"> characters around job titles and company names in every export format: TXT, DOCX, and PDF. The cause was the model defaulting to Markdown bold syntax in its response, a habit picked up from chat-formatted training data, despite the system prompt never asking for it. None of the three export paths interpret Markdown, so the asterisks passed through as literal text, exactly the kind of artifact a real ATS parser would also choke on. The fix has two parts. The system prompt in </w:t>
+      </w:r>
+      <w:r>
+        <w:rPr>
+          <w:rFonts w:ascii="Courier New" w:eastAsia="Courier New" w:hAnsi="Courier New" w:cs="Courier New"/>
+          <w:sz w:val="20"/>
+        </w:rPr>
+        <w:t>rewriter.py</w:t>
+      </w:r>
+      <w:r>
+        <w:rPr>
+          <w:rFonts w:cs="Times New Roman"/>
+        </w:rPr>
+        <w:t xml:space="preserve"> now explicitly forbids Markdown formatting and states why: the output is exported as-is and literal formatting characters will appear in the final resume. A regex-based </w:t>
+      </w:r>
+      <w:r>
+        <w:rPr>
+          <w:rFonts w:ascii="Courier New" w:eastAsia="Courier New" w:hAnsi="Courier New" w:cs="Courier New"/>
+          <w:sz w:val="20"/>
+        </w:rPr>
+        <w:t>strip_markdown_emphasis</w:t>
+      </w:r>
+      <w:r>
+        <w:rPr>
+          <w:rFonts w:cs="Times New Roman"/>
+        </w:rPr>
+        <w:t xml:space="preserve"> function also runs on every API response before it reaches session state, removing any </w:t>
+      </w:r>
+      <w:r>
+        <w:rPr>
+          <w:rFonts w:ascii="Courier New" w:eastAsia="Courier New" w:hAnsi="Courier New" w:cs="Courier New"/>
+          <w:sz w:val="20"/>
+        </w:rPr>
+        <w:t>**bold**</w:t>
+      </w:r>
+      <w:r>
+        <w:rPr>
+          <w:rFonts w:cs="Times New Roman"/>
+        </w:rPr>
+        <w:t xml:space="preserve"> or </w:t>
+      </w:r>
+      <w:r>
+        <w:rPr>
+          <w:rFonts w:ascii="Courier New" w:eastAsia="Courier New" w:hAnsi="Courier New" w:cs="Courier New"/>
+          <w:sz w:val="20"/>
+        </w:rPr>
+        <w:t>__bold__</w:t>
+      </w:r>
+      <w:r>
+        <w:rPr>
+          <w:rFonts w:cs="Times New Roman"/>
+        </w:rPr>
+        <w:t xml:space="preserve"> markers that get through anyway. Prompt instructions alone were not treated as sufficient, since instruction-following on a single stylistic constraint is not guaranteed on every call, and the cost of a defensive regex pass is small next to the cost of a visibly broken resume during a live demo.</w:t>
+      </w:r>
+    </w:p>
+    <w:p>
+      <w:pPr>
+        <w:pStyle w:val="Heading2"/>
+      </w:pPr>
+      <w:r>
+        <w:rPr>
+          <w:rFonts w:ascii="Times New Roman" w:eastAsia="Times New Roman" w:hAnsi="Times New Roman" w:cs="Times New Roman"/>
+          <w:b/>
+          <w:color w:val="000000"/>
+          <w:sz w:val="24"/>
+        </w:rPr>
+        <w:t>3.4 Output formats: TXT, DOCX, and a LaTeX-rendered PDF</w:t>
+      </w:r>
+    </w:p>
+    <w:p>
+      <w:r>
+        <w:rPr>
+          <w:rFonts w:cs="Times New Roman"/>
+        </w:rPr>
+        <w:t>The output layer (Figure 6) originally supported plain text and DOCX. A third format, PDF, was added afterward, and it required resolving a real tension in the requirement itself.</w:t>
+      </w:r>
+    </w:p>
+    <w:p>
+      <w:pPr>
+        <w:keepNext/>
+        <w:ind w:firstLine="0"/>
+      </w:pPr>
+      <w:r>
+        <w:rPr>
+          <w:rFonts w:cs="Times New Roman"/>
+          <w:b/>
+        </w:rPr>
+        <w:t>Figure 6:</w:t>
+      </w:r>
+      <w:r>
+        <w:rPr>
+          <w:rFonts w:cs="Times New Roman"/>
+          <w:i/>
+        </w:rPr>
+        <w:t xml:space="preserve"> Output layer, including the LaTeX-rendered PDF export added after the initial build</w:t>
+      </w:r>
+    </w:p>
+    <w:p>
+      <w:pPr>
+        <w:keepLines/>
+        <w:spacing w:line="240" w:lineRule="auto"/>
+        <w:ind w:firstLine="0"/>
+        <w:jc w:val="center"/>
+      </w:pPr>
+      <w:r>
+        <w:rPr>
+          <w:noProof/>
+        </w:rPr>
+        <w:drawing>
+          <wp:inline distT="0" distB="0" distL="0" distR="0" wp14:anchorId="4C001C1D" wp14:editId="3B436D96">
+            <wp:extent cx="5303520" cy="1131381"/>
+            <wp:effectExtent l="0" t="0" r="0" b="0"/>
+            <wp:docPr id="6" name="Picture 6"/>
+            <wp:cNvGraphicFramePr>
+              <a:graphicFrameLocks xmlns:a="http://schemas.openxmlformats.org/drawingml/2006/main" noChangeAspect="1"/>
+            </wp:cNvGraphicFramePr>
+            <a:graphic xmlns:a="http://schemas.openxmlformats.org/drawingml/2006/main">
+              <a:graphicData uri="http://schemas.openxmlformats.org/drawingml/2006/picture">
+                <pic:pic xmlns:pic="http://schemas.openxmlformats.org/drawingml/2006/picture">
+                  <pic:nvPicPr>
+                    <pic:cNvPr id="0" name="07-output-layer.png"/>
+                    <pic:cNvPicPr/>
+                  </pic:nvPicPr>
+                  <pic:blipFill>
+                    <a:blip r:embed="rId11"/>
+                    <a:stretch>
+                      <a:fillRect/>
+                    </a:stretch>
+                  </pic:blipFill>
+                  <pic:spPr>
+                    <a:xfrm>
+                      <a:off x="0" y="0"/>
+                      <a:ext cx="5303520" cy="1131381"/>
+                    </a:xfrm>
+                    <a:prstGeom prst="rect">
+                      <a:avLst/>
+                    </a:prstGeom>
+                  </pic:spPr>
+                </pic:pic>
+              </a:graphicData>
+            </a:graphic>
+          </wp:inline>
+        </w:drawing>
+      </w:r>
+    </w:p>
+    <w:p>
+      <w:r>
+        <w:rPr>
+          <w:rFonts w:cs="Times New Roman"/>
+        </w:rPr>
+        <w:t xml:space="preserve">“Clean, professional PDF” and “ATS-safe” pull in different directions. Most polished-looking LaTeX resume templates use multi-column layouts, custom fonts, or graphical elements, </w:t>
+      </w:r>
+      <w:r>
+        <w:rPr>
+          <w:rFonts w:cs="Times New Roman"/>
+        </w:rPr>
+        <w:lastRenderedPageBreak/>
+        <w:t xml:space="preserve">exactly the formatting choices that break automated resume parsers. Rather than pick a visually rich template and lose ATS safety, </w:t>
+      </w:r>
+      <w:r>
+        <w:rPr>
+          <w:rFonts w:ascii="Courier New" w:eastAsia="Courier New" w:hAnsi="Courier New" w:cs="Courier New"/>
+          <w:sz w:val="20"/>
+        </w:rPr>
+        <w:t>src/latex_export.py</w:t>
+      </w:r>
+      <w:r>
+        <w:rPr>
+          <w:rFonts w:cs="Times New Roman"/>
+        </w:rPr>
+        <w:t xml:space="preserve"> generates a deliberately minimal, single-column LaTeX </w:t>
+      </w:r>
+      <w:r>
+        <w:rPr>
+          <w:rFonts w:ascii="Courier New" w:eastAsia="Courier New" w:hAnsi="Courier New" w:cs="Courier New"/>
+          <w:sz w:val="20"/>
+        </w:rPr>
+        <w:t>article</w:t>
+      </w:r>
+      <w:r>
+        <w:rPr>
+          <w:rFonts w:cs="Times New Roman"/>
+        </w:rPr>
+        <w:t xml:space="preserve"> document: bold section headers, plain </w:t>
+      </w:r>
+      <w:r>
+        <w:rPr>
+          <w:rFonts w:ascii="Courier New" w:eastAsia="Courier New" w:hAnsi="Courier New" w:cs="Courier New"/>
+          <w:sz w:val="20"/>
+        </w:rPr>
+        <w:t>itemize</w:t>
+      </w:r>
+      <w:r>
+        <w:rPr>
+          <w:rFonts w:cs="Times New Roman"/>
+        </w:rPr>
+        <w:t xml:space="preserve"> bullets, no packages beyond basic margins and font substitution. The same plain-text structure that </w:t>
+      </w:r>
+      <w:r>
+        <w:rPr>
+          <w:rFonts w:ascii="Courier New" w:eastAsia="Courier New" w:hAnsi="Courier New" w:cs="Courier New"/>
+          <w:sz w:val="20"/>
+        </w:rPr>
+        <w:t>resume_export.py</w:t>
+      </w:r>
+      <w:r>
+        <w:rPr>
+          <w:rFonts w:cs="Times New Roman"/>
+        </w:rPr>
+        <w:t xml:space="preserve"> already parses for DOCX (section headers, </w:t>
+      </w:r>
+      <w:r>
+        <w:rPr>
+          <w:rFonts w:ascii="Courier New" w:eastAsia="Courier New" w:hAnsi="Courier New" w:cs="Courier New"/>
+          <w:sz w:val="20"/>
+        </w:rPr>
+        <w:t xml:space="preserve">- </w:t>
+      </w:r>
+      <w:r>
+        <w:rPr>
+          <w:rFonts w:cs="Times New Roman"/>
+        </w:rPr>
+        <w:t xml:space="preserve"> bullets, plain paragraph lines) feeds both exporters, so all three download formats stay in sync without duplicating the parsing logic three times.</w:t>
+      </w:r>
+    </w:p>
+    <w:p>
+      <w:r>
+        <w:rPr>
+          <w:rFonts w:cs="Times New Roman"/>
+        </w:rPr>
+        <w:t xml:space="preserve">Compilation happens by shelling out to a local </w:t>
+      </w:r>
+      <w:r>
+        <w:rPr>
+          <w:rFonts w:ascii="Courier New" w:eastAsia="Courier New" w:hAnsi="Courier New" w:cs="Courier New"/>
+          <w:sz w:val="20"/>
+        </w:rPr>
+        <w:t>pdflatex</w:t>
+      </w:r>
+      <w:r>
+        <w:rPr>
+          <w:rFonts w:cs="Times New Roman"/>
+        </w:rPr>
+        <w:t xml:space="preserve">, run with </w:t>
+      </w:r>
+      <w:r>
+        <w:rPr>
+          <w:rFonts w:ascii="Courier New" w:eastAsia="Courier New" w:hAnsi="Courier New" w:cs="Courier New"/>
+          <w:sz w:val="20"/>
+        </w:rPr>
+        <w:t>-no-shell-escape</w:t>
+      </w:r>
+      <w:r>
+        <w:rPr>
+          <w:rFonts w:cs="Times New Roman"/>
+        </w:rPr>
+        <w:t xml:space="preserve"> to keep the compiled input from being able to execute arbitrary commands, since the LaTeX source is built from model output that the team does not fully control. This was a deliberate choice among three options considered: a local LaTeX engine (chosen), Tectonic (a self-contained LaTeX binary that still requires an external dependency and a first-run network fetch), and a pure-Python PDF library with no system dependency at all. The team picked the local-engine approach because MiKTeX was already installed on the development machine and produced real LaTeX-typeset output (not an approximation), at the cost of adding a system dependency the demo environment must have. That cost is mitigated two ways: the PDF button is wrapped in a try/except in </w:t>
+      </w:r>
+      <w:r>
+        <w:rPr>
+          <w:rFonts w:ascii="Courier New" w:eastAsia="Courier New" w:hAnsi="Courier New" w:cs="Courier New"/>
+          <w:sz w:val="20"/>
+        </w:rPr>
+        <w:t>app.py</w:t>
+      </w:r>
+      <w:r>
+        <w:rPr>
+          <w:rFonts w:cs="Times New Roman"/>
+        </w:rPr>
+        <w:t xml:space="preserve">, so a missing </w:t>
+      </w:r>
+      <w:r>
+        <w:rPr>
+          <w:rFonts w:ascii="Courier New" w:eastAsia="Courier New" w:hAnsi="Courier New" w:cs="Courier New"/>
+          <w:sz w:val="20"/>
+        </w:rPr>
+        <w:t>pdflatex</w:t>
+      </w:r>
+      <w:r>
+        <w:rPr>
+          <w:rFonts w:cs="Times New Roman"/>
+        </w:rPr>
+        <w:t xml:space="preserve"> degrades to a caption explaining the PDF is unavailable rather than crashing the page, and </w:t>
+      </w:r>
+      <w:r>
+        <w:rPr>
+          <w:rFonts w:ascii="Courier New" w:eastAsia="Courier New" w:hAnsi="Courier New" w:cs="Courier New"/>
+          <w:sz w:val="20"/>
+        </w:rPr>
+        <w:t>README.md</w:t>
+      </w:r>
+      <w:r>
+        <w:rPr>
+          <w:rFonts w:cs="Times New Roman"/>
+        </w:rPr>
+        <w:t xml:space="preserve"> documents per-OS installation steps (MiKTeX, MacTeX/BasicTeX, or the </w:t>
+      </w:r>
+      <w:r>
+        <w:rPr>
+          <w:rFonts w:ascii="Courier New" w:eastAsia="Courier New" w:hAnsi="Courier New" w:cs="Courier New"/>
+          <w:sz w:val="20"/>
+        </w:rPr>
+        <w:t>texlive</w:t>
+      </w:r>
+      <w:r>
+        <w:rPr>
+          <w:rFonts w:cs="Times New Roman"/>
+        </w:rPr>
+        <w:t xml:space="preserve"> packages on Linux) for anyone setting up the project fresh.</w:t>
+      </w:r>
+    </w:p>
+    <w:p>
+      <w:r>
+        <w:rPr>
+          <w:rFonts w:cs="Times New Roman"/>
+        </w:rPr>
+        <w:t xml:space="preserve">One design decision was made deliberately conservative: LaTeX generation stays entirely in application code, not in the model. The rewriter's output is still plain text; </w:t>
+      </w:r>
+      <w:r>
+        <w:rPr>
+          <w:rFonts w:ascii="Courier New" w:eastAsia="Courier New" w:hAnsi="Courier New" w:cs="Courier New"/>
+          <w:sz w:val="20"/>
+        </w:rPr>
+        <w:t>build_latex</w:t>
+      </w:r>
+      <w:r>
+        <w:rPr>
+          <w:rFonts w:cs="Times New Roman"/>
+        </w:rPr>
+        <w:t xml:space="preserve"> is the only thing that ever produces </w:t>
+      </w:r>
+      <w:r>
+        <w:rPr>
+          <w:rFonts w:ascii="Courier New" w:eastAsia="Courier New" w:hAnsi="Courier New" w:cs="Courier New"/>
+          <w:sz w:val="20"/>
+        </w:rPr>
+        <w:t>.tex</w:t>
+      </w:r>
+      <w:r>
+        <w:rPr>
+          <w:rFonts w:cs="Times New Roman"/>
+        </w:rPr>
+        <w:t xml:space="preserve"> source. Letting the LLM emit raw LaTeX directly would risk </w:t>
+      </w:r>
+      <w:r>
+        <w:rPr>
+          <w:rFonts w:cs="Times New Roman"/>
+        </w:rPr>
+        <w:lastRenderedPageBreak/>
+        <w:t>malformed commands breaking compilation and would turn the PDF export into a code-injection surface, since compiling LLM-authored LaTeX means compiling unvalidated input.</w:t>
+      </w:r>
+    </w:p>
+    <w:p>
+      <w:pPr>
+        <w:pStyle w:val="Heading2"/>
+      </w:pPr>
+      <w:r>
+        <w:rPr>
+          <w:rFonts w:ascii="Times New Roman" w:eastAsia="Times New Roman" w:hAnsi="Times New Roman" w:cs="Times New Roman"/>
+          <w:b/>
+          <w:color w:val="000000"/>
+          <w:sz w:val="24"/>
+        </w:rPr>
+        <w:t>3.5 Quiz navigation: back, skip, and inline editing</w:t>
+      </w:r>
+    </w:p>
+    <w:p>
+      <w:r>
+        <w:rPr>
+          <w:rFonts w:cs="Times New Roman"/>
+        </w:rPr>
+        <w:t>The quiz originally moved in one direction only. Skipping a question meant typing the literal word “skip” into the chat input, and there was no way to revisit or correct an earlier answer short of restarting the whole flow. Both limits got fixed together, since they turned out to share the same underlying problem.</w:t>
+      </w:r>
+    </w:p>
+    <w:p>
+      <w:r>
+        <w:rPr>
+          <w:rFonts w:cs="Times New Roman"/>
+        </w:rPr>
+        <w:t xml:space="preserve">Two explicit buttons, Back and Skip, replaced the typed convention. Back steps </w:t>
+      </w:r>
+      <w:r>
+        <w:rPr>
+          <w:rFonts w:ascii="Courier New" w:eastAsia="Courier New" w:hAnsi="Courier New" w:cs="Courier New"/>
+          <w:sz w:val="20"/>
+        </w:rPr>
+        <w:t>current_gap_index</w:t>
+      </w:r>
+      <w:r>
+        <w:rPr>
+          <w:rFonts w:cs="Times New Roman"/>
+        </w:rPr>
+        <w:t xml:space="preserve"> down by one and re-presents the previous question; whatever answer was already recorded for it stays in place until the user types a new one or hits Skip. Skip clears any existing answer for the current question and advances, marking it explicitly unresolved rather than silently keeping a stale value. A third control, a small edit button next to each answered question in the transcript, jumps the index directly to that question instead of requiring one Back click per step, useful once the quiz runs several questions deep and the mistake was near the start.</w:t>
+      </w:r>
+    </w:p>
+    <w:p>
+      <w:r>
+        <w:rPr>
+          <w:rFonts w:cs="Times New Roman"/>
+        </w:rPr>
+        <w:t xml:space="preserve">Adding real backward navigation exposed a bug in how the transcript was built. The original code displayed every entry in </w:t>
+      </w:r>
+      <w:r>
+        <w:rPr>
+          <w:rFonts w:ascii="Courier New" w:eastAsia="Courier New" w:hAnsi="Courier New" w:cs="Courier New"/>
+          <w:sz w:val="20"/>
+        </w:rPr>
+        <w:t>st.session_state.answers</w:t>
+      </w:r>
+      <w:r>
+        <w:rPr>
+          <w:rFonts w:cs="Times New Roman"/>
+        </w:rPr>
+        <w:t xml:space="preserve"> in dict insertion order, which works fine as long as answering only ever moves forward. Once a user could jump backward and re-answer a question, that same dict could hold an answer for a question the user had not reached again yet on this pass, and the transcript would show it anyway, or show a stale answer twice next to the question being re-asked. The fix was to stop trusting the dict's own order and derive the transcript from </w:t>
+      </w:r>
+      <w:r>
+        <w:rPr>
+          <w:rFonts w:ascii="Courier New" w:eastAsia="Courier New" w:hAnsi="Courier New" w:cs="Courier New"/>
+          <w:sz w:val="20"/>
+        </w:rPr>
+        <w:t>gaps[:idx]</w:t>
+      </w:r>
+      <w:r>
+        <w:rPr>
+          <w:rFonts w:cs="Times New Roman"/>
+        </w:rPr>
+        <w:t xml:space="preserve"> instead, looking up each gap's answer with </w:t>
+      </w:r>
+      <w:r>
+        <w:rPr>
+          <w:rFonts w:ascii="Courier New" w:eastAsia="Courier New" w:hAnsi="Courier New" w:cs="Courier New"/>
+          <w:sz w:val="20"/>
+        </w:rPr>
+        <w:t>.get(...)</w:t>
+      </w:r>
+      <w:r>
+        <w:rPr>
+          <w:rFonts w:cs="Times New Roman"/>
+        </w:rPr>
+        <w:t xml:space="preserve"> as it goes. What renders is always exactly the questions already passed on the current </w:t>
+      </w:r>
+      <w:r>
+        <w:rPr>
+          <w:rFonts w:cs="Times New Roman"/>
+        </w:rPr>
+        <w:lastRenderedPageBreak/>
+        <w:t>pass through the quiz, independent of whatever else is sitting in the answers dict. The full answer, skip, back, and re-answer sequence was checked in a standalone script before it went into the UI, confirming the transcript and the stored answers stayed in sync across a back-then-reanswer round trip.</w:t>
+      </w:r>
+    </w:p>
+    <w:p>
+      <w:pPr>
+        <w:pStyle w:val="Heading2"/>
+      </w:pPr>
+      <w:r>
+        <w:rPr>
+          <w:rFonts w:ascii="Times New Roman" w:eastAsia="Times New Roman" w:hAnsi="Times New Roman" w:cs="Times New Roman"/>
+          <w:b/>
+          <w:color w:val="000000"/>
+          <w:sz w:val="24"/>
+        </w:rPr>
+        <w:t>3.6 Diff highlighting between draft and rewrite</w:t>
+      </w:r>
+    </w:p>
+    <w:p>
+      <w:r>
+        <w:rPr>
+          <w:rFonts w:cs="Times New Roman"/>
+        </w:rPr>
+        <w:t xml:space="preserve">The before/after view originally showed the draft and the rewrite as two blocks of plain text side by side, with nothing marking what had actually changed beyond what the reader could spot by eye. </w:t>
+      </w:r>
+      <w:r>
+        <w:rPr>
+          <w:rFonts w:ascii="Courier New" w:eastAsia="Courier New" w:hAnsi="Courier New" w:cs="Courier New"/>
+          <w:sz w:val="20"/>
+        </w:rPr>
+        <w:t>src/diff_view.py</w:t>
+      </w:r>
+      <w:r>
+        <w:rPr>
+          <w:rFonts w:cs="Times New Roman"/>
+        </w:rPr>
+        <w:t xml:space="preserve"> adds a word-level diff, computed with Python's own </w:t>
+      </w:r>
+      <w:r>
+        <w:rPr>
+          <w:rFonts w:ascii="Courier New" w:eastAsia="Courier New" w:hAnsi="Courier New" w:cs="Courier New"/>
+          <w:sz w:val="20"/>
+        </w:rPr>
+        <w:t>difflib.SequenceMatcher</w:t>
+      </w:r>
+      <w:r>
+        <w:rPr>
+          <w:rFonts w:cs="Times New Roman"/>
+        </w:rPr>
+        <w:t xml:space="preserve"> rather than a new dependency, comparing the two texts token by token. Tokens are split on </w:t>
+      </w:r>
+      <w:r>
+        <w:rPr>
+          <w:rFonts w:ascii="Courier New" w:eastAsia="Courier New" w:hAnsi="Courier New" w:cs="Courier New"/>
+          <w:sz w:val="20"/>
+        </w:rPr>
+        <w:t>\S+|\s+</w:t>
+      </w:r>
+      <w:r>
+        <w:rPr>
+          <w:rFonts w:cs="Times New Roman"/>
+        </w:rPr>
+        <w:t xml:space="preserve"> rather than on whitespace alone, so line breaks survive as their own tokens and the reconstructed text keeps its original layout.</w:t>
+      </w:r>
+    </w:p>
+    <w:p>
+      <w:r>
+        <w:rPr>
+          <w:rFonts w:cs="Times New Roman"/>
+        </w:rPr>
+        <w:t xml:space="preserve">Words the matcher marks as removed get a struck-through red span in the original-draft panel; words marked as added get a highlighted green span in the rewrite panel. Both panels are HTML-escaped before the highlight spans go in, since the diff output is rendered through </w:t>
+      </w:r>
+      <w:r>
+        <w:rPr>
+          <w:rFonts w:ascii="Courier New" w:eastAsia="Courier New" w:hAnsi="Courier New" w:cs="Courier New"/>
+          <w:sz w:val="20"/>
+        </w:rPr>
+        <w:t>unsafe_allow_html</w:t>
+      </w:r>
+      <w:r>
+        <w:rPr>
+          <w:rFonts w:cs="Times New Roman"/>
+        </w:rPr>
+        <w:t xml:space="preserve"> and the underlying resume text is user-supplied. A small legend sits above both panels using the same two span classes, so the color key is never separate from what it explains. Colors are drawn from the same light/dark palette selection as the rest of the app's custom styling, described in Section 3.7.</w:t>
+      </w:r>
+    </w:p>
+    <w:p>
+      <w:r>
+        <w:rPr>
+          <w:rFonts w:cs="Times New Roman"/>
+        </w:rPr>
+        <w:t>Because the rewrite is a full regeneration rather than a light edit, new section headers appear, content gets reordered, and bullets get rewritten rather than lightly touched. A word-level diff against that much structural change will show large stretches as removed-and-added rather than small in-place edits. That reflects what actually happened to the resume; it is not a sign the diff logic needs sentence- or paragraph-level alignment instead.</w:t>
+      </w:r>
+    </w:p>
+    <w:p>
+      <w:pPr>
+        <w:pStyle w:val="Heading2"/>
+      </w:pPr>
+      <w:r>
+        <w:rPr>
+          <w:rFonts w:ascii="Times New Roman" w:eastAsia="Times New Roman" w:hAnsi="Times New Roman" w:cs="Times New Roman"/>
+          <w:b/>
+          <w:color w:val="000000"/>
+          <w:sz w:val="24"/>
+        </w:rPr>
         <w:lastRenderedPageBreak/>
         <w:t>3.7 A UI polish pass: status widgets, the sidebar stepper, and theme switching</w:t>
       </w:r>
@@ -1408,7 +1408,7 @@
         <w:rPr>
           <w:rFonts w:cs="Times New Roman"/>
         </w:rPr>
-        <w:t xml:space="preserve"> sections instead, Streamlit's own supported mechanism, so its Settings menu re-themes every widget correctly because Streamlit's own tested code does the work, not a CSS patch layered on top of it. A “⚙️ Theme” button, pinned to the bottom of the sidebar, opens a popover showing the currently active theme, read server-side through </w:t>
+        <w:t xml:space="preserve"> sections instead, Streamlit's own supported mechanism, so its Settings menu re-themes every widget correctly because Streamlit's own tested code does the work, not a CSS patch layered on top of it. A “Theme” button, pinned to the bottom of the sidebar, opens a popover showing the currently active theme, read server-side through </w:t>
       </w:r>
       <w:r>
         <w:rPr>
@@ -1541,7 +1541,7 @@
                     <pic:cNvPicPr/>
                   </pic:nvPicPr>
                   <pic:blipFill>
-                    <a:blip r:embed="rId10"/>
+                    <a:blip r:embed="rId12"/>
                     <a:stretch>
                       <a:fillRect/>
                     </a:stretch>
@@ -1712,954 +1712,8 @@
           <w:sz w:val="24"/>
         </w:rPr>
         <w:lastRenderedPageBreak/>
-        <w:t>6. Implementation Status</w:t>
-      </w:r>
-    </w:p>
-    <w:p>
-      <w:r>
-        <w:rPr>
-          <w:rFonts w:cs="Times New Roman"/>
-        </w:rPr>
-        <w:t>All functional requirements for this project are implemented and smoke-tested as of this writing, with two exceptions still open ahead of the Day 2 and Day 3 milestones.</w:t>
-      </w:r>
-    </w:p>
-    <w:tbl>
-      <w:tblPr>
-        <w:tblStyle w:val="TableGrid"/>
-        <w:tblW w:w="0" w:type="auto"/>
-        <w:jc w:val="center"/>
-        <w:tblLook w:val="04A0" w:firstRow="1" w:lastRow="0" w:firstColumn="1" w:lastColumn="0" w:noHBand="0" w:noVBand="1"/>
-      </w:tblPr>
-      <w:tblGrid>
-        <w:gridCol w:w="4320"/>
-        <w:gridCol w:w="4320"/>
-      </w:tblGrid>
-      <w:tr>
-        <w:trPr>
-          <w:cantSplit/>
-          <w:tblHeader/>
-          <w:jc w:val="center"/>
-        </w:trPr>
-        <w:tc>
-          <w:tcPr>
-            <w:tcW w:w="4320" w:type="dxa"/>
-            <w:tcBorders>
-              <w:top w:val="single" w:sz="8" w:space="0" w:color="000000"/>
-              <w:left w:val="nil"/>
-              <w:bottom w:val="single" w:sz="8" w:space="0" w:color="000000"/>
-              <w:right w:val="nil"/>
-            </w:tcBorders>
-            <w:vAlign w:val="center"/>
-          </w:tcPr>
-          <w:p>
-            <w:pPr>
-              <w:spacing w:before="40" w:after="40" w:line="240" w:lineRule="auto"/>
-              <w:ind w:firstLine="0"/>
-            </w:pPr>
-            <w:r>
-              <w:rPr>
-                <w:rFonts w:cs="Times New Roman"/>
-                <w:b/>
-                <w:sz w:val="20"/>
-              </w:rPr>
-              <w:t>Area</w:t>
-            </w:r>
-          </w:p>
-        </w:tc>
-        <w:tc>
-          <w:tcPr>
-            <w:tcW w:w="4320" w:type="dxa"/>
-            <w:tcBorders>
-              <w:top w:val="single" w:sz="8" w:space="0" w:color="000000"/>
-              <w:left w:val="nil"/>
-              <w:bottom w:val="single" w:sz="8" w:space="0" w:color="000000"/>
-              <w:right w:val="nil"/>
-            </w:tcBorders>
-            <w:vAlign w:val="center"/>
-          </w:tcPr>
-          <w:p>
-            <w:pPr>
-              <w:spacing w:before="40" w:after="40" w:line="240" w:lineRule="auto"/>
-              <w:ind w:firstLine="0"/>
-              <w:jc w:val="center"/>
-            </w:pPr>
-            <w:r>
-              <w:rPr>
-                <w:rFonts w:cs="Times New Roman"/>
-                <w:b/>
-                <w:sz w:val="20"/>
-              </w:rPr>
-              <w:t>Status</w:t>
-            </w:r>
-          </w:p>
-        </w:tc>
-      </w:tr>
-      <w:tr>
-        <w:trPr>
-          <w:cantSplit/>
-          <w:jc w:val="center"/>
-        </w:trPr>
-        <w:tc>
-          <w:tcPr>
-            <w:tcW w:w="4320" w:type="dxa"/>
-            <w:tcBorders>
-              <w:top w:val="nil"/>
-              <w:left w:val="nil"/>
-              <w:bottom w:val="nil"/>
-              <w:right w:val="nil"/>
-            </w:tcBorders>
-            <w:vAlign w:val="center"/>
-          </w:tcPr>
-          <w:p>
-            <w:pPr>
-              <w:spacing w:before="40" w:after="40" w:line="240" w:lineRule="auto"/>
-              <w:ind w:firstLine="0"/>
-            </w:pPr>
-            <w:r>
-              <w:rPr>
-                <w:rFonts w:cs="Times New Roman"/>
-                <w:sz w:val="20"/>
-              </w:rPr>
-              <w:t>Intake (paste and file upload)</w:t>
-            </w:r>
-          </w:p>
-        </w:tc>
-        <w:tc>
-          <w:tcPr>
-            <w:tcW w:w="4320" w:type="dxa"/>
-            <w:tcBorders>
-              <w:top w:val="nil"/>
-              <w:left w:val="nil"/>
-              <w:bottom w:val="nil"/>
-              <w:right w:val="nil"/>
-            </w:tcBorders>
-            <w:vAlign w:val="center"/>
-          </w:tcPr>
-          <w:p>
-            <w:pPr>
-              <w:spacing w:before="40" w:after="40" w:line="240" w:lineRule="auto"/>
-              <w:ind w:firstLine="0"/>
-              <w:jc w:val="center"/>
-            </w:pPr>
-            <w:r>
-              <w:rPr>
-                <w:rFonts w:cs="Times New Roman"/>
-                <w:sz w:val="20"/>
-              </w:rPr>
-              <w:t>Done</w:t>
-            </w:r>
-          </w:p>
-        </w:tc>
-      </w:tr>
-      <w:tr>
-        <w:trPr>
-          <w:cantSplit/>
-          <w:jc w:val="center"/>
-        </w:trPr>
-        <w:tc>
-          <w:tcPr>
-            <w:tcW w:w="4320" w:type="dxa"/>
-            <w:tcBorders>
-              <w:top w:val="nil"/>
-              <w:left w:val="nil"/>
-              <w:bottom w:val="nil"/>
-              <w:right w:val="nil"/>
-            </w:tcBorders>
-            <w:vAlign w:val="center"/>
-          </w:tcPr>
-          <w:p>
-            <w:pPr>
-              <w:spacing w:before="40" w:after="40" w:line="240" w:lineRule="auto"/>
-              <w:ind w:firstLine="0"/>
-            </w:pPr>
-            <w:r>
-              <w:rPr>
-                <w:rFonts w:cs="Times New Roman"/>
-                <w:sz w:val="20"/>
-              </w:rPr>
-              <w:t>Rule-based gap detection, interleaved and capped</w:t>
-            </w:r>
-          </w:p>
-        </w:tc>
-        <w:tc>
-          <w:tcPr>
-            <w:tcW w:w="4320" w:type="dxa"/>
-            <w:tcBorders>
-              <w:top w:val="nil"/>
-              <w:left w:val="nil"/>
-              <w:bottom w:val="nil"/>
-              <w:right w:val="nil"/>
-            </w:tcBorders>
-            <w:vAlign w:val="center"/>
-          </w:tcPr>
-          <w:p>
-            <w:pPr>
-              <w:spacing w:before="40" w:after="40" w:line="240" w:lineRule="auto"/>
-              <w:ind w:firstLine="0"/>
-              <w:jc w:val="center"/>
-            </w:pPr>
-            <w:r>
-              <w:rPr>
-                <w:rFonts w:cs="Times New Roman"/>
-                <w:sz w:val="20"/>
-              </w:rPr>
-              <w:t>Done</w:t>
-            </w:r>
-          </w:p>
-        </w:tc>
-      </w:tr>
-      <w:tr>
-        <w:trPr>
-          <w:cantSplit/>
-          <w:jc w:val="center"/>
-        </w:trPr>
-        <w:tc>
-          <w:tcPr>
-            <w:tcW w:w="4320" w:type="dxa"/>
-            <w:tcBorders>
-              <w:top w:val="nil"/>
-              <w:left w:val="nil"/>
-              <w:bottom w:val="nil"/>
-              <w:right w:val="nil"/>
-            </w:tcBorders>
-            <w:vAlign w:val="center"/>
-          </w:tcPr>
-          <w:p>
-            <w:pPr>
-              <w:spacing w:before="40" w:after="40" w:line="240" w:lineRule="auto"/>
-              <w:ind w:firstLine="0"/>
-            </w:pPr>
-            <w:r>
-              <w:rPr>
-                <w:rFonts w:cs="Times New Roman"/>
-                <w:sz w:val="20"/>
-              </w:rPr>
-              <w:t>Content-specific question generation via API, with fallback</w:t>
-            </w:r>
-          </w:p>
-        </w:tc>
-        <w:tc>
-          <w:tcPr>
-            <w:tcW w:w="4320" w:type="dxa"/>
-            <w:tcBorders>
-              <w:top w:val="nil"/>
-              <w:left w:val="nil"/>
-              <w:bottom w:val="nil"/>
-              <w:right w:val="nil"/>
-            </w:tcBorders>
-            <w:vAlign w:val="center"/>
-          </w:tcPr>
-          <w:p>
-            <w:pPr>
-              <w:spacing w:before="40" w:after="40" w:line="240" w:lineRule="auto"/>
-              <w:ind w:firstLine="0"/>
-              <w:jc w:val="center"/>
-            </w:pPr>
-            <w:r>
-              <w:rPr>
-                <w:rFonts w:cs="Times New Roman"/>
-                <w:sz w:val="20"/>
-              </w:rPr>
-              <w:t>Done</w:t>
-            </w:r>
-          </w:p>
-        </w:tc>
-      </w:tr>
-      <w:tr>
-        <w:trPr>
-          <w:cantSplit/>
-          <w:jc w:val="center"/>
-        </w:trPr>
-        <w:tc>
-          <w:tcPr>
-            <w:tcW w:w="4320" w:type="dxa"/>
-            <w:tcBorders>
-              <w:top w:val="nil"/>
-              <w:left w:val="nil"/>
-              <w:bottom w:val="nil"/>
-              <w:right w:val="nil"/>
-            </w:tcBorders>
-            <w:vAlign w:val="center"/>
-          </w:tcPr>
-          <w:p>
-            <w:pPr>
-              <w:spacing w:before="40" w:after="40" w:line="240" w:lineRule="auto"/>
-              <w:ind w:firstLine="0"/>
-            </w:pPr>
-            <w:r>
-              <w:rPr>
-                <w:rFonts w:cs="Times New Roman"/>
-                <w:sz w:val="20"/>
-              </w:rPr>
-              <w:t>Quiz loop (one question at a time, skip support, answer tracking)</w:t>
-            </w:r>
-          </w:p>
-        </w:tc>
-        <w:tc>
-          <w:tcPr>
-            <w:tcW w:w="4320" w:type="dxa"/>
-            <w:tcBorders>
-              <w:top w:val="nil"/>
-              <w:left w:val="nil"/>
-              <w:bottom w:val="nil"/>
-              <w:right w:val="nil"/>
-            </w:tcBorders>
-            <w:vAlign w:val="center"/>
-          </w:tcPr>
-          <w:p>
-            <w:pPr>
-              <w:spacing w:before="40" w:after="40" w:line="240" w:lineRule="auto"/>
-              <w:ind w:firstLine="0"/>
-              <w:jc w:val="center"/>
-            </w:pPr>
-            <w:r>
-              <w:rPr>
-                <w:rFonts w:cs="Times New Roman"/>
-                <w:sz w:val="20"/>
-              </w:rPr>
-              <w:t>Done</w:t>
-            </w:r>
-          </w:p>
-        </w:tc>
-      </w:tr>
-      <w:tr>
-        <w:trPr>
-          <w:cantSplit/>
-          <w:jc w:val="center"/>
-        </w:trPr>
-        <w:tc>
-          <w:tcPr>
-            <w:tcW w:w="4320" w:type="dxa"/>
-            <w:tcBorders>
-              <w:top w:val="nil"/>
-              <w:left w:val="nil"/>
-              <w:bottom w:val="nil"/>
-              <w:right w:val="nil"/>
-            </w:tcBorders>
-            <w:vAlign w:val="center"/>
-          </w:tcPr>
-          <w:p>
-            <w:pPr>
-              <w:spacing w:before="40" w:after="40" w:line="240" w:lineRule="auto"/>
-              <w:ind w:firstLine="0"/>
-            </w:pPr>
-            <w:r>
-              <w:rPr>
-                <w:rFonts w:cs="Times New Roman"/>
-                <w:sz w:val="20"/>
-              </w:rPr>
-              <w:t>ATS rewrite prompt and retry</w:t>
-            </w:r>
-          </w:p>
-        </w:tc>
-        <w:tc>
-          <w:tcPr>
-            <w:tcW w:w="4320" w:type="dxa"/>
-            <w:tcBorders>
-              <w:top w:val="nil"/>
-              <w:left w:val="nil"/>
-              <w:bottom w:val="nil"/>
-              <w:right w:val="nil"/>
-            </w:tcBorders>
-            <w:vAlign w:val="center"/>
-          </w:tcPr>
-          <w:p>
-            <w:pPr>
-              <w:spacing w:before="40" w:after="40" w:line="240" w:lineRule="auto"/>
-              <w:ind w:firstLine="0"/>
-              <w:jc w:val="center"/>
-            </w:pPr>
-            <w:r>
-              <w:rPr>
-                <w:rFonts w:cs="Times New Roman"/>
-                <w:sz w:val="20"/>
-              </w:rPr>
-              <w:t>Done</w:t>
-            </w:r>
-          </w:p>
-        </w:tc>
-      </w:tr>
-      <w:tr>
-        <w:trPr>
-          <w:cantSplit/>
-          <w:jc w:val="center"/>
-        </w:trPr>
-        <w:tc>
-          <w:tcPr>
-            <w:tcW w:w="4320" w:type="dxa"/>
-            <w:tcBorders>
-              <w:top w:val="nil"/>
-              <w:left w:val="nil"/>
-              <w:bottom w:val="nil"/>
-              <w:right w:val="nil"/>
-            </w:tcBorders>
-            <w:vAlign w:val="center"/>
-          </w:tcPr>
-          <w:p>
-            <w:pPr>
-              <w:spacing w:before="40" w:after="40" w:line="240" w:lineRule="auto"/>
-              <w:ind w:firstLine="0"/>
-            </w:pPr>
-            <w:r>
-              <w:rPr>
-                <w:rFonts w:cs="Times New Roman"/>
-                <w:sz w:val="20"/>
-              </w:rPr>
-              <w:t>Markdown-stripping fix (Section 3.3)</w:t>
-            </w:r>
-          </w:p>
-        </w:tc>
-        <w:tc>
-          <w:tcPr>
-            <w:tcW w:w="4320" w:type="dxa"/>
-            <w:tcBorders>
-              <w:top w:val="nil"/>
-              <w:left w:val="nil"/>
-              <w:bottom w:val="nil"/>
-              <w:right w:val="nil"/>
-            </w:tcBorders>
-            <w:vAlign w:val="center"/>
-          </w:tcPr>
-          <w:p>
-            <w:pPr>
-              <w:spacing w:before="40" w:after="40" w:line="240" w:lineRule="auto"/>
-              <w:ind w:firstLine="0"/>
-              <w:jc w:val="center"/>
-            </w:pPr>
-            <w:r>
-              <w:rPr>
-                <w:rFonts w:cs="Times New Roman"/>
-                <w:sz w:val="20"/>
-              </w:rPr>
-              <w:t>Done</w:t>
-            </w:r>
-          </w:p>
-        </w:tc>
-      </w:tr>
-      <w:tr>
-        <w:trPr>
-          <w:cantSplit/>
-          <w:jc w:val="center"/>
-        </w:trPr>
-        <w:tc>
-          <w:tcPr>
-            <w:tcW w:w="4320" w:type="dxa"/>
-            <w:tcBorders>
-              <w:top w:val="nil"/>
-              <w:left w:val="nil"/>
-              <w:bottom w:val="nil"/>
-              <w:right w:val="nil"/>
-            </w:tcBorders>
-            <w:vAlign w:val="center"/>
-          </w:tcPr>
-          <w:p>
-            <w:pPr>
-              <w:spacing w:before="40" w:after="40" w:line="240" w:lineRule="auto"/>
-              <w:ind w:firstLine="0"/>
-            </w:pPr>
-            <w:r>
-              <w:rPr>
-                <w:rFonts w:cs="Times New Roman"/>
-                <w:sz w:val="20"/>
-              </w:rPr>
-              <w:t>Output: TXT, DOCX, and PDF (Section 3.4)</w:t>
-            </w:r>
-          </w:p>
-        </w:tc>
-        <w:tc>
-          <w:tcPr>
-            <w:tcW w:w="4320" w:type="dxa"/>
-            <w:tcBorders>
-              <w:top w:val="nil"/>
-              <w:left w:val="nil"/>
-              <w:bottom w:val="nil"/>
-              <w:right w:val="nil"/>
-            </w:tcBorders>
-            <w:vAlign w:val="center"/>
-          </w:tcPr>
-          <w:p>
-            <w:pPr>
-              <w:spacing w:before="40" w:after="40" w:line="240" w:lineRule="auto"/>
-              <w:ind w:firstLine="0"/>
-              <w:jc w:val="center"/>
-            </w:pPr>
-            <w:r>
-              <w:rPr>
-                <w:rFonts w:cs="Times New Roman"/>
-                <w:sz w:val="20"/>
-              </w:rPr>
-              <w:t>Done</w:t>
-            </w:r>
-          </w:p>
-        </w:tc>
-      </w:tr>
-      <w:tr>
-        <w:trPr>
-          <w:cantSplit/>
-          <w:jc w:val="center"/>
-        </w:trPr>
-        <w:tc>
-          <w:tcPr>
-            <w:tcW w:w="4320" w:type="dxa"/>
-            <w:tcBorders>
-              <w:top w:val="nil"/>
-              <w:left w:val="nil"/>
-              <w:bottom w:val="nil"/>
-              <w:right w:val="nil"/>
-            </w:tcBorders>
-            <w:vAlign w:val="center"/>
-          </w:tcPr>
-          <w:p>
-            <w:pPr>
-              <w:spacing w:before="40" w:after="40" w:line="240" w:lineRule="auto"/>
-              <w:ind w:firstLine="0"/>
-            </w:pPr>
-            <w:r>
-              <w:rPr>
-                <w:rFonts w:cs="Times New Roman"/>
-                <w:sz w:val="20"/>
-              </w:rPr>
-              <w:t>Quiz back/skip buttons and inline answer editing (Section 3.5)</w:t>
-            </w:r>
-          </w:p>
-        </w:tc>
-        <w:tc>
-          <w:tcPr>
-            <w:tcW w:w="4320" w:type="dxa"/>
-            <w:tcBorders>
-              <w:top w:val="nil"/>
-              <w:left w:val="nil"/>
-              <w:bottom w:val="nil"/>
-              <w:right w:val="nil"/>
-            </w:tcBorders>
-            <w:vAlign w:val="center"/>
-          </w:tcPr>
-          <w:p>
-            <w:pPr>
-              <w:spacing w:before="40" w:after="40" w:line="240" w:lineRule="auto"/>
-              <w:ind w:firstLine="0"/>
-              <w:jc w:val="center"/>
-            </w:pPr>
-            <w:r>
-              <w:rPr>
-                <w:rFonts w:cs="Times New Roman"/>
-                <w:sz w:val="20"/>
-              </w:rPr>
-              <w:t>Done</w:t>
-            </w:r>
-          </w:p>
-        </w:tc>
-      </w:tr>
-      <w:tr>
-        <w:trPr>
-          <w:cantSplit/>
-          <w:jc w:val="center"/>
-        </w:trPr>
-        <w:tc>
-          <w:tcPr>
-            <w:tcW w:w="4320" w:type="dxa"/>
-            <w:tcBorders>
-              <w:top w:val="nil"/>
-              <w:left w:val="nil"/>
-              <w:bottom w:val="nil"/>
-              <w:right w:val="nil"/>
-            </w:tcBorders>
-            <w:vAlign w:val="center"/>
-          </w:tcPr>
-          <w:p>
-            <w:pPr>
-              <w:spacing w:before="40" w:after="40" w:line="240" w:lineRule="auto"/>
-              <w:ind w:firstLine="0"/>
-            </w:pPr>
-            <w:r>
-              <w:rPr>
-                <w:rFonts w:cs="Times New Roman"/>
-                <w:sz w:val="20"/>
-              </w:rPr>
-              <w:t>Before/after diff highlighting (Section 3.6)</w:t>
-            </w:r>
-          </w:p>
-        </w:tc>
-        <w:tc>
-          <w:tcPr>
-            <w:tcW w:w="4320" w:type="dxa"/>
-            <w:tcBorders>
-              <w:top w:val="nil"/>
-              <w:left w:val="nil"/>
-              <w:bottom w:val="nil"/>
-              <w:right w:val="nil"/>
-            </w:tcBorders>
-            <w:vAlign w:val="center"/>
-          </w:tcPr>
-          <w:p>
-            <w:pPr>
-              <w:spacing w:before="40" w:after="40" w:line="240" w:lineRule="auto"/>
-              <w:ind w:firstLine="0"/>
-              <w:jc w:val="center"/>
-            </w:pPr>
-            <w:r>
-              <w:rPr>
-                <w:rFonts w:cs="Times New Roman"/>
-                <w:sz w:val="20"/>
-              </w:rPr>
-              <w:t>Done</w:t>
-            </w:r>
-          </w:p>
-        </w:tc>
-      </w:tr>
-      <w:tr>
-        <w:trPr>
-          <w:cantSplit/>
-          <w:jc w:val="center"/>
-        </w:trPr>
-        <w:tc>
-          <w:tcPr>
-            <w:tcW w:w="4320" w:type="dxa"/>
-            <w:tcBorders>
-              <w:top w:val="nil"/>
-              <w:left w:val="nil"/>
-              <w:bottom w:val="nil"/>
-              <w:right w:val="nil"/>
-            </w:tcBorders>
-            <w:vAlign w:val="center"/>
-          </w:tcPr>
-          <w:p>
-            <w:pPr>
-              <w:spacing w:before="40" w:after="40" w:line="240" w:lineRule="auto"/>
-              <w:ind w:firstLine="0"/>
-            </w:pPr>
-            <w:r>
-              <w:rPr>
-                <w:rFonts w:cs="Times New Roman"/>
-                <w:sz w:val="20"/>
-              </w:rPr>
-              <w:t>Status-widget progress narration, sidebar stepper, theme switching (Section 3.7)</w:t>
-            </w:r>
-          </w:p>
-        </w:tc>
-        <w:tc>
-          <w:tcPr>
-            <w:tcW w:w="4320" w:type="dxa"/>
-            <w:tcBorders>
-              <w:top w:val="nil"/>
-              <w:left w:val="nil"/>
-              <w:bottom w:val="nil"/>
-              <w:right w:val="nil"/>
-            </w:tcBorders>
-            <w:vAlign w:val="center"/>
-          </w:tcPr>
-          <w:p>
-            <w:pPr>
-              <w:spacing w:before="40" w:after="40" w:line="240" w:lineRule="auto"/>
-              <w:ind w:firstLine="0"/>
-              <w:jc w:val="center"/>
-            </w:pPr>
-            <w:r>
-              <w:rPr>
-                <w:rFonts w:cs="Times New Roman"/>
-                <w:sz w:val="20"/>
-              </w:rPr>
-              <w:t>Done</w:t>
-            </w:r>
-          </w:p>
-        </w:tc>
-      </w:tr>
-      <w:tr>
-        <w:trPr>
-          <w:cantSplit/>
-          <w:jc w:val="center"/>
-        </w:trPr>
-        <w:tc>
-          <w:tcPr>
-            <w:tcW w:w="4320" w:type="dxa"/>
-            <w:tcBorders>
-              <w:top w:val="nil"/>
-              <w:left w:val="nil"/>
-              <w:bottom w:val="nil"/>
-              <w:right w:val="nil"/>
-            </w:tcBorders>
-            <w:vAlign w:val="center"/>
-          </w:tcPr>
-          <w:p>
-            <w:pPr>
-              <w:spacing w:before="40" w:after="40" w:line="240" w:lineRule="auto"/>
-              <w:ind w:firstLine="0"/>
-            </w:pPr>
-            <w:r>
-              <w:rPr>
-                <w:rFonts w:cs="Times New Roman"/>
-                <w:sz w:val="20"/>
-              </w:rPr>
-              <w:t>Confirm-before-reset, download toasts, reduced-motion support (Section 3.7)</w:t>
-            </w:r>
-          </w:p>
-        </w:tc>
-        <w:tc>
-          <w:tcPr>
-            <w:tcW w:w="4320" w:type="dxa"/>
-            <w:tcBorders>
-              <w:top w:val="nil"/>
-              <w:left w:val="nil"/>
-              <w:bottom w:val="nil"/>
-              <w:right w:val="nil"/>
-            </w:tcBorders>
-            <w:vAlign w:val="center"/>
-          </w:tcPr>
-          <w:p>
-            <w:pPr>
-              <w:spacing w:before="40" w:after="40" w:line="240" w:lineRule="auto"/>
-              <w:ind w:firstLine="0"/>
-              <w:jc w:val="center"/>
-            </w:pPr>
-            <w:r>
-              <w:rPr>
-                <w:rFonts w:cs="Times New Roman"/>
-                <w:sz w:val="20"/>
-              </w:rPr>
-              <w:t>Done</w:t>
-            </w:r>
-          </w:p>
-        </w:tc>
-      </w:tr>
-      <w:tr>
-        <w:trPr>
-          <w:cantSplit/>
-          <w:jc w:val="center"/>
-        </w:trPr>
-        <w:tc>
-          <w:tcPr>
-            <w:tcW w:w="4320" w:type="dxa"/>
-            <w:tcBorders>
-              <w:top w:val="nil"/>
-              <w:left w:val="nil"/>
-              <w:bottom w:val="nil"/>
-              <w:right w:val="nil"/>
-            </w:tcBorders>
-            <w:vAlign w:val="center"/>
-          </w:tcPr>
-          <w:p>
-            <w:pPr>
-              <w:spacing w:before="40" w:after="40" w:line="240" w:lineRule="auto"/>
-              <w:ind w:firstLine="0"/>
-            </w:pPr>
-            <w:r>
-              <w:rPr>
-                <w:rFonts w:cs="Times New Roman"/>
-                <w:sz w:val="20"/>
-              </w:rPr>
-              <w:t>Live-demo fallback, Layers 1 and 2 (Section 4)</w:t>
-            </w:r>
-          </w:p>
-        </w:tc>
-        <w:tc>
-          <w:tcPr>
-            <w:tcW w:w="4320" w:type="dxa"/>
-            <w:tcBorders>
-              <w:top w:val="nil"/>
-              <w:left w:val="nil"/>
-              <w:bottom w:val="nil"/>
-              <w:right w:val="nil"/>
-            </w:tcBorders>
-            <w:vAlign w:val="center"/>
-          </w:tcPr>
-          <w:p>
-            <w:pPr>
-              <w:spacing w:before="40" w:after="40" w:line="240" w:lineRule="auto"/>
-              <w:ind w:firstLine="0"/>
-              <w:jc w:val="center"/>
-            </w:pPr>
-            <w:r>
-              <w:rPr>
-                <w:rFonts w:cs="Times New Roman"/>
-                <w:sz w:val="20"/>
-              </w:rPr>
-              <w:t>Done</w:t>
-            </w:r>
-          </w:p>
-        </w:tc>
-      </w:tr>
-      <w:tr>
-        <w:trPr>
-          <w:cantSplit/>
-          <w:jc w:val="center"/>
-        </w:trPr>
-        <w:tc>
-          <w:tcPr>
-            <w:tcW w:w="4320" w:type="dxa"/>
-            <w:tcBorders>
-              <w:top w:val="nil"/>
-              <w:left w:val="nil"/>
-              <w:bottom w:val="nil"/>
-              <w:right w:val="nil"/>
-            </w:tcBorders>
-            <w:vAlign w:val="center"/>
-          </w:tcPr>
-          <w:p>
-            <w:pPr>
-              <w:spacing w:before="40" w:after="40" w:line="240" w:lineRule="auto"/>
-              <w:ind w:firstLine="0"/>
-            </w:pPr>
-            <w:r>
-              <w:rPr>
-                <w:rFonts w:cs="Times New Roman"/>
-                <w:sz w:val="20"/>
-              </w:rPr>
-              <w:t>Live-demo fallback, Layer 3 (recorded backup)</w:t>
-            </w:r>
-          </w:p>
-        </w:tc>
-        <w:tc>
-          <w:tcPr>
-            <w:tcW w:w="4320" w:type="dxa"/>
-            <w:tcBorders>
-              <w:top w:val="nil"/>
-              <w:left w:val="nil"/>
-              <w:bottom w:val="nil"/>
-              <w:right w:val="nil"/>
-            </w:tcBorders>
-            <w:vAlign w:val="center"/>
-          </w:tcPr>
-          <w:p>
-            <w:pPr>
-              <w:spacing w:before="40" w:after="40" w:line="240" w:lineRule="auto"/>
-              <w:ind w:firstLine="0"/>
-              <w:jc w:val="center"/>
-            </w:pPr>
-            <w:r>
-              <w:rPr>
-                <w:rFonts w:cs="Times New Roman"/>
-                <w:sz w:val="20"/>
-              </w:rPr>
-              <w:t>Not yet done</w:t>
-            </w:r>
-          </w:p>
-        </w:tc>
-      </w:tr>
-      <w:tr>
-        <w:trPr>
-          <w:cantSplit/>
-          <w:jc w:val="center"/>
-        </w:trPr>
-        <w:tc>
-          <w:tcPr>
-            <w:tcW w:w="4320" w:type="dxa"/>
-            <w:tcBorders>
-              <w:top w:val="nil"/>
-              <w:left w:val="nil"/>
-              <w:bottom w:val="nil"/>
-              <w:right w:val="nil"/>
-            </w:tcBorders>
-            <w:vAlign w:val="center"/>
-          </w:tcPr>
-          <w:p>
-            <w:pPr>
-              <w:spacing w:before="40" w:after="40" w:line="240" w:lineRule="auto"/>
-              <w:ind w:firstLine="0"/>
-            </w:pPr>
-            <w:r>
-              <w:rPr>
-                <w:rFonts w:cs="Times New Roman"/>
-                <w:sz w:val="20"/>
-              </w:rPr>
-              <w:t>Live browser walkthrough of the full flow</w:t>
-            </w:r>
-          </w:p>
-        </w:tc>
-        <w:tc>
-          <w:tcPr>
-            <w:tcW w:w="4320" w:type="dxa"/>
-            <w:tcBorders>
-              <w:top w:val="nil"/>
-              <w:left w:val="nil"/>
-              <w:bottom w:val="nil"/>
-              <w:right w:val="nil"/>
-            </w:tcBorders>
-            <w:vAlign w:val="center"/>
-          </w:tcPr>
-          <w:p>
-            <w:pPr>
-              <w:spacing w:before="40" w:after="40" w:line="240" w:lineRule="auto"/>
-              <w:ind w:firstLine="0"/>
-              <w:jc w:val="center"/>
-            </w:pPr>
-            <w:r>
-              <w:rPr>
-                <w:rFonts w:cs="Times New Roman"/>
-                <w:sz w:val="20"/>
-              </w:rPr>
-              <w:t>Not yet done</w:t>
-            </w:r>
-          </w:p>
-        </w:tc>
-      </w:tr>
-      <w:tr>
-        <w:trPr>
-          <w:cantSplit/>
-          <w:jc w:val="center"/>
-        </w:trPr>
-        <w:tc>
-          <w:tcPr>
-            <w:tcW w:w="4320" w:type="dxa"/>
-            <w:tcBorders>
-              <w:top w:val="nil"/>
-              <w:left w:val="nil"/>
-              <w:bottom w:val="single" w:sz="8" w:space="0" w:color="000000"/>
-              <w:right w:val="nil"/>
-            </w:tcBorders>
-            <w:vAlign w:val="center"/>
-          </w:tcPr>
-          <w:p>
-            <w:pPr>
-              <w:spacing w:before="40" w:after="40" w:line="240" w:lineRule="auto"/>
-              <w:ind w:firstLine="0"/>
-            </w:pPr>
-            <w:r>
-              <w:rPr>
-                <w:rFonts w:cs="Times New Roman"/>
-                <w:sz w:val="20"/>
-              </w:rPr>
-              <w:t>End-to-end timing against the two-minute target (NFR1)</w:t>
-            </w:r>
-          </w:p>
-        </w:tc>
-        <w:tc>
-          <w:tcPr>
-            <w:tcW w:w="4320" w:type="dxa"/>
-            <w:tcBorders>
-              <w:top w:val="nil"/>
-              <w:left w:val="nil"/>
-              <w:bottom w:val="single" w:sz="8" w:space="0" w:color="000000"/>
-              <w:right w:val="nil"/>
-            </w:tcBorders>
-            <w:vAlign w:val="center"/>
-          </w:tcPr>
-          <w:p>
-            <w:pPr>
-              <w:spacing w:before="40" w:after="40" w:line="240" w:lineRule="auto"/>
-              <w:ind w:firstLine="0"/>
-              <w:jc w:val="center"/>
-            </w:pPr>
-            <w:r>
-              <w:rPr>
-                <w:rFonts w:cs="Times New Roman"/>
-                <w:sz w:val="20"/>
-              </w:rPr>
-              <w:t>Not yet formally timed</w:t>
-            </w:r>
-          </w:p>
-        </w:tc>
-      </w:tr>
-    </w:tbl>
-    <w:p>
-      <w:pPr>
-        <w:spacing w:line="240" w:lineRule="auto"/>
-        <w:ind w:firstLine="0"/>
-      </w:pPr>
-    </w:p>
-    <w:p>
-      <w:pPr>
-        <w:pStyle w:val="Heading1"/>
-      </w:pPr>
+        <w:t>6</w:t>
+      </w:r>
       <w:r>
         <w:rPr>
           <w:rFonts w:ascii="Times New Roman" w:eastAsia="Times New Roman" w:hAnsi="Times New Roman" w:cs="Times New Roman"/>
@@ -2667,7 +1721,7 @@
           <w:color w:val="000000"/>
           <w:sz w:val="24"/>
         </w:rPr>
-        <w:t>7. Limitations and Future Work</w:t>
+        <w:t>. Limitations and Future Work</w:t>
       </w:r>
     </w:p>
     <w:p>
@@ -2683,7 +1737,6 @@
         <w:rPr>
           <w:rFonts w:cs="Times New Roman"/>
         </w:rPr>
-        <w:lastRenderedPageBreak/>
         <w:t>Two things are open questions rather than firm decisions. The five-question cap and two-question floor described in Section 3.2 have not been validated against how an actual user reacts to the quiz length, only against the team's own judgment during testing. And the recorded backup video for the third fallback layer, needed before the live presentation, has not yet been captured.</w:t>
       </w:r>
     </w:p>
@@ -2719,15 +1772,24 @@
           <w:color w:val="000000"/>
           <w:sz w:val="24"/>
         </w:rPr>
-        <w:t>8. Interface Screenshots</w:t>
-      </w:r>
-    </w:p>
-    <w:p>
-      <w:r>
-        <w:rPr>
-          <w:rFonts w:cs="Times New Roman"/>
-        </w:rPr>
-        <w:t>The diagrams in Sections 2 through 4 describe the architecture. These screenshots show the actual running application, captured from a live session against a real resume rather than the synthetic sample. Figure 8 is the intake screen before any input, with the sidebar stepper and the “⚙️ Theme” button both visible in their idle state. Figure 9 shows the same screen after uploading a DOCX, the extracted text populating the paste-in text area exactly as FR2 requires.</w:t>
+        <w:t>7</w:t>
+      </w:r>
+      <w:r>
+        <w:rPr>
+          <w:rFonts w:ascii="Times New Roman" w:eastAsia="Times New Roman" w:hAnsi="Times New Roman" w:cs="Times New Roman"/>
+          <w:b/>
+          <w:color w:val="000000"/>
+          <w:sz w:val="24"/>
+        </w:rPr>
+        <w:t>. Interface Screenshots</w:t>
+      </w:r>
+    </w:p>
+    <w:p>
+      <w:r>
+        <w:rPr>
+          <w:rFonts w:cs="Times New Roman"/>
+        </w:rPr>
+        <w:t>The diagrams in Sections 2 through 4 describe the architecture. These screenshots show the actual running application, captured from a live session against a real resume rather than the synthetic sample. Figure 8 is the intake screen before any input, with the sidebar stepper and the “Theme” button both visible in their idle state. Figure 9 shows the same screen after uploading a DOCX, the extracted text populating the paste-in text area exactly as FR2 requires.</w:t>
       </w:r>
     </w:p>
     <w:p>
@@ -2778,7 +1840,7 @@
                     <pic:cNvPicPr/>
                   </pic:nvPicPr>
                   <pic:blipFill>
-                    <a:blip r:embed="rId11"/>
+                    <a:blip r:embed="rId13"/>
                     <a:stretch>
                       <a:fillRect/>
                     </a:stretch>
@@ -2843,157 +1905,6 @@
                 <pic:pic xmlns:pic="http://schemas.openxmlformats.org/drawingml/2006/picture">
                   <pic:nvPicPr>
                     <pic:cNvPr id="0" name="02-uploaded-draft.png"/>
-                    <pic:cNvPicPr/>
-                  </pic:nvPicPr>
-                  <pic:blipFill>
-                    <a:blip r:embed="rId12"/>
-                    <a:stretch>
-                      <a:fillRect/>
-                    </a:stretch>
-                  </pic:blipFill>
-                  <pic:spPr>
-                    <a:xfrm>
-                      <a:off x="0" y="0"/>
-                      <a:ext cx="5303520" cy="2817495"/>
-                    </a:xfrm>
-                    <a:prstGeom prst="rect">
-                      <a:avLst/>
-                    </a:prstGeom>
-                  </pic:spPr>
-                </pic:pic>
-              </a:graphicData>
-            </a:graphic>
-          </wp:inline>
-        </w:drawing>
-      </w:r>
-    </w:p>
-    <w:p>
-      <w:r>
-        <w:rPr>
-          <w:rFonts w:cs="Times New Roman"/>
-        </w:rPr>
-        <w:t xml:space="preserve">Figures 10 and 11 cover the quiz. Figure 10, question 2 of 4, shows the transcript for a question already answered next to its inline edit button, the pencil icon from Section 3.5, the current question below it, and the Back and Skip buttons under the chat input. Figure 11 shows the quiz complete, including two questions the user chose to skip, each rendered as “(skipped)” </w:t>
-      </w:r>
-      <w:r>
-        <w:rPr>
-          <w:rFonts w:cs="Times New Roman"/>
-        </w:rPr>
-        <w:lastRenderedPageBreak/>
-        <w:t>in the transcript rather than a fabricated answer, next to the “All questions answered” confirmation and the Generate button.</w:t>
-      </w:r>
-    </w:p>
-    <w:p>
-      <w:pPr>
-        <w:keepNext/>
-        <w:ind w:firstLine="0"/>
-      </w:pPr>
-      <w:r>
-        <w:rPr>
-          <w:rFonts w:cs="Times New Roman"/>
-          <w:b/>
-        </w:rPr>
-        <w:t>Figure 10:</w:t>
-      </w:r>
-      <w:r>
-        <w:rPr>
-          <w:rFonts w:cs="Times New Roman"/>
-          <w:i/>
-        </w:rPr>
-        <w:t xml:space="preserve"> Mid-quiz, with the inline edit button on an already-answered question</w:t>
-      </w:r>
-    </w:p>
-    <w:p>
-      <w:pPr>
-        <w:keepLines/>
-        <w:spacing w:line="240" w:lineRule="auto"/>
-        <w:ind w:firstLine="0"/>
-        <w:jc w:val="center"/>
-      </w:pPr>
-      <w:r>
-        <w:rPr>
-          <w:noProof/>
-        </w:rPr>
-        <w:drawing>
-          <wp:inline distT="0" distB="0" distL="0" distR="0" wp14:anchorId="1604AAAC" wp14:editId="4C1457C2">
-            <wp:extent cx="5303520" cy="2817495"/>
-            <wp:effectExtent l="0" t="0" r="0" b="0"/>
-            <wp:docPr id="10" name="Picture 10"/>
-            <wp:cNvGraphicFramePr>
-              <a:graphicFrameLocks xmlns:a="http://schemas.openxmlformats.org/drawingml/2006/main" noChangeAspect="1"/>
-            </wp:cNvGraphicFramePr>
-            <a:graphic xmlns:a="http://schemas.openxmlformats.org/drawingml/2006/main">
-              <a:graphicData uri="http://schemas.openxmlformats.org/drawingml/2006/picture">
-                <pic:pic xmlns:pic="http://schemas.openxmlformats.org/drawingml/2006/picture">
-                  <pic:nvPicPr>
-                    <pic:cNvPr id="0" name="03-quiz-navigation.png"/>
-                    <pic:cNvPicPr/>
-                  </pic:nvPicPr>
-                  <pic:blipFill>
-                    <a:blip r:embed="rId13"/>
-                    <a:stretch>
-                      <a:fillRect/>
-                    </a:stretch>
-                  </pic:blipFill>
-                  <pic:spPr>
-                    <a:xfrm>
-                      <a:off x="0" y="0"/>
-                      <a:ext cx="5303520" cy="2817495"/>
-                    </a:xfrm>
-                    <a:prstGeom prst="rect">
-                      <a:avLst/>
-                    </a:prstGeom>
-                  </pic:spPr>
-                </pic:pic>
-              </a:graphicData>
-            </a:graphic>
-          </wp:inline>
-        </w:drawing>
-      </w:r>
-    </w:p>
-    <w:p>
-      <w:pPr>
-        <w:keepNext/>
-        <w:ind w:firstLine="0"/>
-      </w:pPr>
-      <w:r>
-        <w:rPr>
-          <w:rFonts w:cs="Times New Roman"/>
-          <w:b/>
-        </w:rPr>
-        <w:t>Figure 11:</w:t>
-      </w:r>
-      <w:r>
-        <w:rPr>
-          <w:rFonts w:cs="Times New Roman"/>
-          <w:i/>
-        </w:rPr>
-        <w:t xml:space="preserve"> Quiz complete, with two skipped questions shown honestly rather than guessed</w:t>
-      </w:r>
-    </w:p>
-    <w:p>
-      <w:pPr>
-        <w:keepLines/>
-        <w:spacing w:line="240" w:lineRule="auto"/>
-        <w:ind w:firstLine="0"/>
-        <w:jc w:val="center"/>
-      </w:pPr>
-      <w:r>
-        <w:rPr>
-          <w:noProof/>
-        </w:rPr>
-        <w:drawing>
-          <wp:inline distT="0" distB="0" distL="0" distR="0" wp14:anchorId="43778E0F" wp14:editId="5C91B475">
-            <wp:extent cx="5303520" cy="2817495"/>
-            <wp:effectExtent l="0" t="0" r="0" b="0"/>
-            <wp:docPr id="11" name="Picture 11"/>
-            <wp:cNvGraphicFramePr>
-              <a:graphicFrameLocks xmlns:a="http://schemas.openxmlformats.org/drawingml/2006/main" noChangeAspect="1"/>
-            </wp:cNvGraphicFramePr>
-            <a:graphic xmlns:a="http://schemas.openxmlformats.org/drawingml/2006/main">
-              <a:graphicData uri="http://schemas.openxmlformats.org/drawingml/2006/picture">
-                <pic:pic xmlns:pic="http://schemas.openxmlformats.org/drawingml/2006/picture">
-                  <pic:nvPicPr>
-                    <pic:cNvPr id="0" name="04-quiz-complete.png"/>
                     <pic:cNvPicPr/>
                   </pic:nvPicPr>
                   <pic:blipFill>
@@ -3023,14 +1934,14 @@
         <w:rPr>
           <w:rFonts w:cs="Times New Roman"/>
         </w:rPr>
-        <w:t xml:space="preserve">Figures 12 and 13 cover the result. Figure 12 shows the diff-highlighted before/after view from Section 3.6 mid-scroll, the removed/added legend above both panels and the strikethrough and highlight spans visible on real rewritten content: contact details and a job title stripped out on </w:t>
+        <w:t xml:space="preserve">Figures 10 and 11 cover the quiz. Figure 10, question 2 of 4, shows the transcript for a question already answered next to its inline edit button, the pencil icon from Section 3.5, the current question below it, and the Back and Skip buttons under the chat input. Figure 11 shows the quiz complete, including two questions the user chose to skip, each rendered as “(skipped)” </w:t>
       </w:r>
       <w:r>
         <w:rPr>
           <w:rFonts w:cs="Times New Roman"/>
         </w:rPr>
         <w:lastRenderedPageBreak/>
-        <w:t>the left, quantified phrasing added on the right. Figure 13 shows the bottom of that same screen, the rest of the diff followed by the “Export your resume” card from Section 3.4, the PDF button marked “(recommended),” and each format's one-line caption underneath it.</w:t>
+        <w:t>in the transcript rather than a fabricated answer, next to the “All questions answered” confirmation and the Generate button.</w:t>
       </w:r>
     </w:p>
     <w:p>
@@ -3043,14 +1954,14 @@
           <w:rFonts w:cs="Times New Roman"/>
           <w:b/>
         </w:rPr>
-        <w:t>Figure 12:</w:t>
+        <w:t>Figure 10:</w:t>
       </w:r>
       <w:r>
         <w:rPr>
           <w:rFonts w:cs="Times New Roman"/>
           <w:i/>
         </w:rPr>
-        <w:t xml:space="preserve"> Diff-highlighted before/after view, with the removed/added legend</w:t>
+        <w:t xml:space="preserve"> Mid-quiz, with the inline edit button on an already-answered question</w:t>
       </w:r>
     </w:p>
     <w:p>
@@ -3065,10 +1976,10 @@
           <w:noProof/>
         </w:rPr>
         <w:drawing>
-          <wp:inline distT="0" distB="0" distL="0" distR="0" wp14:anchorId="5CC4D2A1" wp14:editId="05D15A6F">
+          <wp:inline distT="0" distB="0" distL="0" distR="0" wp14:anchorId="1604AAAC" wp14:editId="4C1457C2">
             <wp:extent cx="5303520" cy="2817495"/>
             <wp:effectExtent l="0" t="0" r="0" b="0"/>
-            <wp:docPr id="12" name="Picture 12"/>
+            <wp:docPr id="10" name="Picture 10"/>
             <wp:cNvGraphicFramePr>
               <a:graphicFrameLocks xmlns:a="http://schemas.openxmlformats.org/drawingml/2006/main" noChangeAspect="1"/>
             </wp:cNvGraphicFramePr>
@@ -3076,7 +1987,7 @@
               <a:graphicData uri="http://schemas.openxmlformats.org/drawingml/2006/picture">
                 <pic:pic xmlns:pic="http://schemas.openxmlformats.org/drawingml/2006/picture">
                   <pic:nvPicPr>
-                    <pic:cNvPr id="0" name="05-diff-view-top.png"/>
+                    <pic:cNvPr id="0" name="03-quiz-navigation.png"/>
                     <pic:cNvPicPr/>
                   </pic:nvPicPr>
                   <pic:blipFill>
@@ -3111,14 +2022,14 @@
           <w:rFonts w:cs="Times New Roman"/>
           <w:b/>
         </w:rPr>
-        <w:t>Figure 13:</w:t>
+        <w:t>Figure 11:</w:t>
       </w:r>
       <w:r>
         <w:rPr>
           <w:rFonts w:cs="Times New Roman"/>
           <w:i/>
         </w:rPr>
-        <w:t xml:space="preserve"> The export card, PDF marked as the recommended format</w:t>
+        <w:t xml:space="preserve"> Quiz complete, with two skipped questions shown honestly rather than guessed</w:t>
       </w:r>
     </w:p>
     <w:p>
@@ -3133,10 +2044,10 @@
           <w:noProof/>
         </w:rPr>
         <w:drawing>
-          <wp:inline distT="0" distB="0" distL="0" distR="0" wp14:anchorId="4B871609" wp14:editId="18653C93">
+          <wp:inline distT="0" distB="0" distL="0" distR="0" wp14:anchorId="43778E0F" wp14:editId="5C91B475">
             <wp:extent cx="5303520" cy="2817495"/>
             <wp:effectExtent l="0" t="0" r="0" b="0"/>
-            <wp:docPr id="13" name="Picture 13"/>
+            <wp:docPr id="11" name="Picture 11"/>
             <wp:cNvGraphicFramePr>
               <a:graphicFrameLocks xmlns:a="http://schemas.openxmlformats.org/drawingml/2006/main" noChangeAspect="1"/>
             </wp:cNvGraphicFramePr>
@@ -3144,7 +2055,7 @@
               <a:graphicData uri="http://schemas.openxmlformats.org/drawingml/2006/picture">
                 <pic:pic xmlns:pic="http://schemas.openxmlformats.org/drawingml/2006/picture">
                   <pic:nvPicPr>
-                    <pic:cNvPr id="0" name="06-export-card.png"/>
+                    <pic:cNvPr id="0" name="04-quiz-complete.png"/>
                     <pic:cNvPicPr/>
                   </pic:nvPicPr>
                   <pic:blipFill>
@@ -3170,6 +2081,157 @@
       </w:r>
     </w:p>
     <w:p>
+      <w:r>
+        <w:rPr>
+          <w:rFonts w:cs="Times New Roman"/>
+        </w:rPr>
+        <w:t xml:space="preserve">Figures 12 and 13 cover the result. Figure 12 shows the diff-highlighted before/after view from Section 3.6 mid-scroll, the removed/added legend above both panels and the strikethrough and highlight spans visible on real rewritten content: contact details and a job title stripped out on </w:t>
+      </w:r>
+      <w:r>
+        <w:rPr>
+          <w:rFonts w:cs="Times New Roman"/>
+        </w:rPr>
+        <w:lastRenderedPageBreak/>
+        <w:t>the left, quantified phrasing added on the right. Figure 13 shows the bottom of that same screen, the rest of the diff followed by the “Export your resume” card from Section 3.4, the PDF button marked “(recommended),” and each format's one-line caption underneath it.</w:t>
+      </w:r>
+    </w:p>
+    <w:p>
+      <w:pPr>
+        <w:keepNext/>
+        <w:ind w:firstLine="0"/>
+      </w:pPr>
+      <w:r>
+        <w:rPr>
+          <w:rFonts w:cs="Times New Roman"/>
+          <w:b/>
+        </w:rPr>
+        <w:t>Figure 12:</w:t>
+      </w:r>
+      <w:r>
+        <w:rPr>
+          <w:rFonts w:cs="Times New Roman"/>
+          <w:i/>
+        </w:rPr>
+        <w:t xml:space="preserve"> Diff-highlighted before/after view, with the removed/added legend</w:t>
+      </w:r>
+    </w:p>
+    <w:p>
+      <w:pPr>
+        <w:keepLines/>
+        <w:spacing w:line="240" w:lineRule="auto"/>
+        <w:ind w:firstLine="0"/>
+        <w:jc w:val="center"/>
+      </w:pPr>
+      <w:r>
+        <w:rPr>
+          <w:noProof/>
+        </w:rPr>
+        <w:drawing>
+          <wp:inline distT="0" distB="0" distL="0" distR="0" wp14:anchorId="5CC4D2A1" wp14:editId="05D15A6F">
+            <wp:extent cx="5303520" cy="2817495"/>
+            <wp:effectExtent l="0" t="0" r="0" b="0"/>
+            <wp:docPr id="12" name="Picture 12"/>
+            <wp:cNvGraphicFramePr>
+              <a:graphicFrameLocks xmlns:a="http://schemas.openxmlformats.org/drawingml/2006/main" noChangeAspect="1"/>
+            </wp:cNvGraphicFramePr>
+            <a:graphic xmlns:a="http://schemas.openxmlformats.org/drawingml/2006/main">
+              <a:graphicData uri="http://schemas.openxmlformats.org/drawingml/2006/picture">
+                <pic:pic xmlns:pic="http://schemas.openxmlformats.org/drawingml/2006/picture">
+                  <pic:nvPicPr>
+                    <pic:cNvPr id="0" name="05-diff-view-top.png"/>
+                    <pic:cNvPicPr/>
+                  </pic:nvPicPr>
+                  <pic:blipFill>
+                    <a:blip r:embed="rId17"/>
+                    <a:stretch>
+                      <a:fillRect/>
+                    </a:stretch>
+                  </pic:blipFill>
+                  <pic:spPr>
+                    <a:xfrm>
+                      <a:off x="0" y="0"/>
+                      <a:ext cx="5303520" cy="2817495"/>
+                    </a:xfrm>
+                    <a:prstGeom prst="rect">
+                      <a:avLst/>
+                    </a:prstGeom>
+                  </pic:spPr>
+                </pic:pic>
+              </a:graphicData>
+            </a:graphic>
+          </wp:inline>
+        </w:drawing>
+      </w:r>
+    </w:p>
+    <w:p>
+      <w:pPr>
+        <w:keepNext/>
+        <w:ind w:firstLine="0"/>
+      </w:pPr>
+      <w:r>
+        <w:rPr>
+          <w:rFonts w:cs="Times New Roman"/>
+          <w:b/>
+        </w:rPr>
+        <w:t>Figure 13:</w:t>
+      </w:r>
+      <w:r>
+        <w:rPr>
+          <w:rFonts w:cs="Times New Roman"/>
+          <w:i/>
+        </w:rPr>
+        <w:t xml:space="preserve"> The export card, PDF marked as the recommended format</w:t>
+      </w:r>
+    </w:p>
+    <w:p>
+      <w:pPr>
+        <w:keepLines/>
+        <w:spacing w:line="240" w:lineRule="auto"/>
+        <w:ind w:firstLine="0"/>
+        <w:jc w:val="center"/>
+      </w:pPr>
+      <w:r>
+        <w:rPr>
+          <w:noProof/>
+        </w:rPr>
+        <w:drawing>
+          <wp:inline distT="0" distB="0" distL="0" distR="0" wp14:anchorId="4B871609" wp14:editId="18653C93">
+            <wp:extent cx="5303520" cy="2817495"/>
+            <wp:effectExtent l="0" t="0" r="0" b="0"/>
+            <wp:docPr id="13" name="Picture 13"/>
+            <wp:cNvGraphicFramePr>
+              <a:graphicFrameLocks xmlns:a="http://schemas.openxmlformats.org/drawingml/2006/main" noChangeAspect="1"/>
+            </wp:cNvGraphicFramePr>
+            <a:graphic xmlns:a="http://schemas.openxmlformats.org/drawingml/2006/main">
+              <a:graphicData uri="http://schemas.openxmlformats.org/drawingml/2006/picture">
+                <pic:pic xmlns:pic="http://schemas.openxmlformats.org/drawingml/2006/picture">
+                  <pic:nvPicPr>
+                    <pic:cNvPr id="0" name="06-export-card.png"/>
+                    <pic:cNvPicPr/>
+                  </pic:nvPicPr>
+                  <pic:blipFill>
+                    <a:blip r:embed="rId18"/>
+                    <a:stretch>
+                      <a:fillRect/>
+                    </a:stretch>
+                  </pic:blipFill>
+                  <pic:spPr>
+                    <a:xfrm>
+                      <a:off x="0" y="0"/>
+                      <a:ext cx="5303520" cy="2817495"/>
+                    </a:xfrm>
+                    <a:prstGeom prst="rect">
+                      <a:avLst/>
+                    </a:prstGeom>
+                  </pic:spPr>
+                </pic:pic>
+              </a:graphicData>
+            </a:graphic>
+          </wp:inline>
+        </w:drawing>
+      </w:r>
+    </w:p>
+    <w:p>
       <w:pPr>
         <w:pStyle w:val="Heading1"/>
       </w:pPr>
@@ -3194,7 +2256,7 @@
     </w:p>
     <w:p/>
     <w:sectPr>
-      <w:headerReference w:type="default" r:id="rId17"/>
+      <w:headerReference w:type="default" r:id="rId19"/>
       <w:pgSz w:w="12240" w:h="15840"/>
       <w:pgMar w:top="1440" w:right="1440" w:bottom="1440" w:left="1440" w:header="720" w:footer="720" w:gutter="0"/>
       <w:cols w:space="720"/>
@@ -3202,6 +2264,56 @@
     </w:sectPr>
   </w:body>
 </w:document>
+</file>
+
+<file path=word/endnotes.xml><?xml version="1.0" encoding="utf-8"?>
+<w:endnotes xmlns:wpc="http://schemas.microsoft.com/office/word/2010/wordprocessingCanvas" xmlns:cx="http://schemas.microsoft.com/office/drawing/2014/chartex" xmlns:cx1="http://schemas.microsoft.com/office/drawing/2015/9/8/chartex" xmlns:cx2="http://schemas.microsoft.com/office/drawing/2015/10/21/chartex" xmlns:cx3="http://schemas.microsoft.com/office/drawing/2016/5/9/chartex" xmlns:cx4="http://schemas.microsoft.com/office/drawing/2016/5/10/chartex" xmlns:cx5="http://schemas.microsoft.com/office/drawing/2016/5/11/chartex" xmlns:cx6="http://schemas.microsoft.com/office/drawing/2016/5/12/chartex" xmlns:cx7="http://schemas.microsoft.com/office/drawing/2016/5/13/chartex" xmlns:cx8="http://schemas.microsoft.com/office/drawing/2016/5/14/chartex" xmlns:mc="http://schemas.openxmlformats.org/markup-compatibility/2006" xmlns:aink="http://schemas.microsoft.com/office/drawing/2016/ink" xmlns:am3d="http://schemas.microsoft.com/office/drawing/2017/model3d" xmlns:o="urn:schemas-microsoft-com:office:office" xmlns:oel="http://schemas.microsoft.com/office/2019/extlst" xmlns:r="http://schemas.openxmlformats.org/officeDocument/2006/relationships" xmlns:m="http://schemas.openxmlformats.org/officeDocument/2006/math" xmlns:v="urn:schemas-microsoft-com:vml" xmlns:wp14="http://schemas.microsoft.com/office/word/2010/wordprocessingDrawing" xmlns:wp="http://schemas.openxmlformats.org/drawingml/2006/wordprocessingDrawing" xmlns:w10="urn:schemas-microsoft-com:office:word" xmlns:w="http://schemas.openxmlformats.org/wordprocessingml/2006/main" xmlns:w14="http://schemas.microsoft.com/office/word/2010/wordml" xmlns:w15="http://schemas.microsoft.com/office/word/2012/wordml" xmlns:w16cex="http://schemas.microsoft.com/office/word/2018/wordml/cex" xmlns:w16cid="http://schemas.microsoft.com/office/word/2016/wordml/cid" xmlns:w16="http://schemas.microsoft.com/office/word/2018/wordml" xmlns:w16du="http://schemas.microsoft.com/office/word/2023/wordml/word16du" xmlns:w16sdtdh="http://schemas.microsoft.com/office/word/2020/wordml/sdtdatahash" xmlns:w16sdtfl="http://schemas.microsoft.com/office/word/2024/wordml/sdtformatlock" xmlns:w16se="http://schemas.microsoft.com/office/word/2015/wordml/symex" xmlns:wpg="http://schemas.microsoft.com/office/word/2010/wordprocessingGroup" xmlns:wpi="http://schemas.microsoft.com/office/word/2010/wordprocessingInk" xmlns:wne="http://schemas.microsoft.com/office/word/2006/wordml" xmlns:wps="http://schemas.microsoft.com/office/word/2010/wordprocessingShape" mc:Ignorable="w14 w15 w16se w16cid w16 w16cex w16sdtdh w16sdtfl w16du wp14">
+  <w:endnote w:type="separator" w:id="-1">
+    <w:p>
+      <w:pPr>
+        <w:spacing w:line="240" w:lineRule="auto"/>
+      </w:pPr>
+      <w:r>
+        <w:separator/>
+      </w:r>
+    </w:p>
+  </w:endnote>
+  <w:endnote w:type="continuationSeparator" w:id="0">
+    <w:p>
+      <w:pPr>
+        <w:spacing w:line="240" w:lineRule="auto"/>
+      </w:pPr>
+      <w:r>
+        <w:continuationSeparator/>
+      </w:r>
+    </w:p>
+  </w:endnote>
+</w:endnotes>
+</file>
+
+<file path=word/footnotes.xml><?xml version="1.0" encoding="utf-8"?>
+<w:footnotes xmlns:wpc="http://schemas.microsoft.com/office/word/2010/wordprocessingCanvas" xmlns:cx="http://schemas.microsoft.com/office/drawing/2014/chartex" xmlns:cx1="http://schemas.microsoft.com/office/drawing/2015/9/8/chartex" xmlns:cx2="http://schemas.microsoft.com/office/drawing/2015/10/21/chartex" xmlns:cx3="http://schemas.microsoft.com/office/drawing/2016/5/9/chartex" xmlns:cx4="http://schemas.microsoft.com/office/drawing/2016/5/10/chartex" xmlns:cx5="http://schemas.microsoft.com/office/drawing/2016/5/11/chartex" xmlns:cx6="http://schemas.microsoft.com/office/drawing/2016/5/12/chartex" xmlns:cx7="http://schemas.microsoft.com/office/drawing/2016/5/13/chartex" xmlns:cx8="http://schemas.microsoft.com/office/drawing/2016/5/14/chartex" xmlns:mc="http://schemas.openxmlformats.org/markup-compatibility/2006" xmlns:aink="http://schemas.microsoft.com/office/drawing/2016/ink" xmlns:am3d="http://schemas.microsoft.com/office/drawing/2017/model3d" xmlns:o="urn:schemas-microsoft-com:office:office" xmlns:oel="http://schemas.microsoft.com/office/2019/extlst" xmlns:r="http://schemas.openxmlformats.org/officeDocument/2006/relationships" xmlns:m="http://schemas.openxmlformats.org/officeDocument/2006/math" xmlns:v="urn:schemas-microsoft-com:vml" xmlns:wp14="http://schemas.microsoft.com/office/word/2010/wordprocessingDrawing" xmlns:wp="http://schemas.openxmlformats.org/drawingml/2006/wordprocessingDrawing" xmlns:w10="urn:schemas-microsoft-com:office:word" xmlns:w="http://schemas.openxmlformats.org/wordprocessingml/2006/main" xmlns:w14="http://schemas.microsoft.com/office/word/2010/wordml" xmlns:w15="http://schemas.microsoft.com/office/word/2012/wordml" xmlns:w16cex="http://schemas.microsoft.com/office/word/2018/wordml/cex" xmlns:w16cid="http://schemas.microsoft.com/office/word/2016/wordml/cid" xmlns:w16="http://schemas.microsoft.com/office/word/2018/wordml" xmlns:w16du="http://schemas.microsoft.com/office/word/2023/wordml/word16du" xmlns:w16sdtdh="http://schemas.microsoft.com/office/word/2020/wordml/sdtdatahash" xmlns:w16sdtfl="http://schemas.microsoft.com/office/word/2024/wordml/sdtformatlock" xmlns:w16se="http://schemas.microsoft.com/office/word/2015/wordml/symex" xmlns:wpg="http://schemas.microsoft.com/office/word/2010/wordprocessingGroup" xmlns:wpi="http://schemas.microsoft.com/office/word/2010/wordprocessingInk" xmlns:wne="http://schemas.microsoft.com/office/word/2006/wordml" xmlns:wps="http://schemas.microsoft.com/office/word/2010/wordprocessingShape" mc:Ignorable="w14 w15 w16se w16cid w16 w16cex w16sdtdh w16sdtfl w16du wp14">
+  <w:footnote w:type="separator" w:id="-1">
+    <w:p>
+      <w:pPr>
+        <w:spacing w:line="240" w:lineRule="auto"/>
+      </w:pPr>
+      <w:r>
+        <w:separator/>
+      </w:r>
+    </w:p>
+  </w:footnote>
+  <w:footnote w:type="continuationSeparator" w:id="0">
+    <w:p>
+      <w:pPr>
+        <w:spacing w:line="240" w:lineRule="auto"/>
+      </w:pPr>
+      <w:r>
+        <w:continuationSeparator/>
+      </w:r>
+    </w:p>
+  </w:footnote>
+</w:footnotes>
 </file>
 
 <file path=word/header1.xml><?xml version="1.0" encoding="utf-8"?>
@@ -4085,6 +3197,7 @@
         <w:ilvl w:val="1"/>
       </w:numPr>
       <w:spacing w:after="160" w:line="278" w:lineRule="auto"/>
+      <w:ind w:firstLine="720"/>
     </w:pPr>
     <w:rPr>
       <w:rFonts w:asciiTheme="minorHAnsi" w:eastAsiaTheme="majorEastAsia" w:hAnsiTheme="minorHAnsi" w:cstheme="majorBidi"/>

</xml_diff>